<commit_message>
docs: jelaskan pengelompokan 19 penyebab menjadi 5 masalah pokok
Penyebab pada diagram fishbone dan Tabel 2 kini bernomor 1-19, lalu
ditambahkan aturan pengelompokan (prinsip afinitas, satu penyebab satu
kelompok, uji silang dengan temuan Ombudsman) beserta Tabel 3 yang
memetakan setiap penyebab ke masalah pokoknya sebelum analisis USG.
Nomor tabel berikutnya disesuaikan.

Co-Authored-By: Claude Opus 5.5 <noreply@anthropic.com>
Claude-Session: https://claude.ai/code/session_017XuHpMtD5H1LphoiP8K87Z
</commit_message>
<xml_diff>
--- a/dokumen/esai-pkp-2026/Jawaban_Esai_PKP_2026_SJUT.docx
+++ b/dokumen/esai-pkp-2026/Jawaban_Esai_PKP_2026_SJUT.docx
@@ -1541,7 +1541,7 @@
           <w:szCs w:val="20"/>
           <w:lang w:val="id-ID"/>
         </w:rPr>
-        <w:t xml:space="preserve">Sumber: analisis penulis berdasarkan kasus dan temuan Ombudsman RI.</w:t>
+        <w:t xml:space="preserve">Nomor 1–19 merujuk pada uraian penyebab di Tabel 2 dan pengelompokan masalah pokok di Tabel 3. Sumber: analisis penulis berdasarkan kasus dan temuan Ombudsman RI.</w:t>
       </w:r>
     </w:p>
     <w:p>
@@ -1762,7 +1762,7 @@
                 <w:szCs w:val="22"/>
                 <w:lang w:val="id-ID"/>
               </w:rPr>
-              <w:t xml:space="preserve">Tidak ada </w:t>
+              <w:t xml:space="preserve">(1) Tidak ada </w:t>
             </w:r>
             <w:r>
               <w:rPr>
@@ -1847,7 +1847,7 @@
                 <w:szCs w:val="22"/>
                 <w:lang w:val="id-ID"/>
               </w:rPr>
-              <w:t xml:space="preserve">Kapasitas dan komitmen BUMD pelaksana rendah</w:t>
+              <w:t xml:space="preserve">(2) Kapasitas dan komitmen BUMD pelaksana rendah</w:t>
             </w:r>
           </w:p>
         </w:tc>
@@ -1912,7 +1912,7 @@
                 <w:szCs w:val="22"/>
                 <w:lang w:val="id-ID"/>
               </w:rPr>
-              <w:t xml:space="preserve">Pengawasan Pemprov atas BUMD lemah; pola kerja reaktif</w:t>
+              <w:t xml:space="preserve">(3) Pengawasan Pemprov atas BUMD lemah; pola kerja reaktif</w:t>
             </w:r>
           </w:p>
         </w:tc>
@@ -1939,7 +1939,7 @@
                 <w:szCs w:val="22"/>
                 <w:lang w:val="id-ID"/>
               </w:rPr>
-              <w:t xml:space="preserve">Pemerintah baru bertindak setelah ada pengaduan atau korban, termasuk kasus warga terlilit kabel optik hingga meninggal.</w:t>
+              <w:t xml:space="preserve">Progres BUMD tidak dievaluasi, dan pemerintah baru bertindak setelah ada pengaduan atau korban, termasuk kasus warga terlilit kabel optik hingga meninggal.</w:t>
             </w:r>
           </w:p>
         </w:tc>
@@ -2018,7 +2018,7 @@
                 <w:szCs w:val="22"/>
                 <w:lang w:val="id-ID"/>
               </w:rPr>
-              <w:t xml:space="preserve">Regulasi penugasan habis tanpa pengganti dan evaluasi</w:t>
+              <w:t xml:space="preserve">(4) Regulasi penugasan habis tanpa pengganti dan evaluasi</w:t>
             </w:r>
           </w:p>
         </w:tc>
@@ -2083,7 +2083,7 @@
                 <w:szCs w:val="22"/>
                 <w:lang w:val="id-ID"/>
               </w:rPr>
-              <w:t xml:space="preserve">Belum ada rencana induk (RTRW, RPJMD, target)</w:t>
+              <w:t xml:space="preserve">(5) Belum ada rencana induk (RTRW, RPJMD, target)</w:t>
             </w:r>
           </w:p>
         </w:tc>
@@ -2148,7 +2148,7 @@
                 <w:szCs w:val="22"/>
                 <w:lang w:val="id-ID"/>
               </w:rPr>
-              <w:t xml:space="preserve">Tidak ada monev berkala dan KPI penugasan</w:t>
+              <w:t xml:space="preserve">(6) Tidak ada monev berkala dan KPI penugasan</w:t>
             </w:r>
           </w:p>
         </w:tc>
@@ -2213,7 +2213,7 @@
                 <w:szCs w:val="22"/>
                 <w:lang w:val="id-ID"/>
               </w:rPr>
-              <w:t xml:space="preserve">Panduan teknis SJUT nasional belum tersedia</w:t>
+              <w:t xml:space="preserve">(7) Panduan teknis SJUT nasional belum tersedia</w:t>
             </w:r>
           </w:p>
         </w:tc>
@@ -2319,7 +2319,7 @@
                 <w:szCs w:val="22"/>
                 <w:lang w:val="id-ID"/>
               </w:rPr>
-              <w:t xml:space="preserve">Tarif sewa tidak transparan dan belum disepakati operator</w:t>
+              <w:t xml:space="preserve">(8) Tarif sewa tidak transparan dan belum disepakati operator</w:t>
             </w:r>
           </w:p>
         </w:tc>
@@ -2384,7 +2384,7 @@
                 <w:szCs w:val="22"/>
                 <w:lang w:val="id-ID"/>
               </w:rPr>
-              <w:t xml:space="preserve">Model bisnis dan pengembalian investasi BUMD tidak pasti</w:t>
+              <w:t xml:space="preserve">(9) Model bisnis dan pengembalian investasi BUMD tidak pasti</w:t>
             </w:r>
           </w:p>
         </w:tc>
@@ -2449,7 +2449,7 @@
                 <w:szCs w:val="22"/>
                 <w:lang w:val="id-ID"/>
               </w:rPr>
-              <w:t xml:space="preserve">Belum ada insentif dan disinsentif migrasi kabel</w:t>
+              <w:t xml:space="preserve">(10) Belum ada insentif dan disinsentif migrasi kabel</w:t>
             </w:r>
           </w:p>
         </w:tc>
@@ -2555,7 +2555,7 @@
                 <w:szCs w:val="22"/>
                 <w:lang w:val="id-ID"/>
               </w:rPr>
-              <w:t xml:space="preserve">Kabel bekas dan limbah (tanah, permukaan, udara) tidak dikelola</w:t>
+              <w:t xml:space="preserve">(11) Kabel bekas dan limbah (tanah, permukaan, udara) tidak dikelola</w:t>
             </w:r>
           </w:p>
         </w:tc>
@@ -2620,7 +2620,7 @@
                 <w:szCs w:val="22"/>
                 <w:lang w:val="id-ID"/>
               </w:rPr>
-              <w:t xml:space="preserve">Belum ada regulasi pengelolaan limbah kabel</w:t>
+              <w:t xml:space="preserve">(12) Belum ada regulasi pengelolaan limbah kabel</w:t>
             </w:r>
           </w:p>
         </w:tc>
@@ -2685,7 +2685,7 @@
                 <w:szCs w:val="22"/>
                 <w:lang w:val="id-ID"/>
               </w:rPr>
-              <w:t xml:space="preserve">Inventaris pemilik dan status jaringan eksisting tidak ada</w:t>
+              <w:t xml:space="preserve">(13) Inventaris pemilik dan status jaringan eksisting tidak ada</w:t>
             </w:r>
           </w:p>
         </w:tc>
@@ -2791,7 +2791,7 @@
                 <w:szCs w:val="22"/>
                 <w:lang w:val="id-ID"/>
               </w:rPr>
-              <w:t xml:space="preserve">Belum ada peta digital utilitas terpadu (atas dan bawah tanah)</w:t>
+              <w:t xml:space="preserve">(14) Belum ada peta digital utilitas terpadu (atas dan bawah tanah)</w:t>
             </w:r>
           </w:p>
         </w:tc>
@@ -2856,7 +2856,7 @@
                 <w:szCs w:val="22"/>
                 <w:lang w:val="id-ID"/>
               </w:rPr>
-              <w:t xml:space="preserve">Belum ada dasbor progres dan peringatan dini</w:t>
+              <w:t xml:space="preserve">(15) Belum ada dasbor progres dan peringatan dini</w:t>
             </w:r>
           </w:p>
         </w:tc>
@@ -2921,7 +2921,7 @@
                 <w:szCs w:val="22"/>
                 <w:lang w:val="id-ID"/>
               </w:rPr>
-              <w:t xml:space="preserve">Kanal aduan tidak terhubung ke tindak lanjut pemilik kabel</w:t>
+              <w:t xml:space="preserve">(16) Kanal aduan tidak terhubung ke tindak lanjut pemilik kabel</w:t>
             </w:r>
           </w:p>
         </w:tc>
@@ -3027,7 +3027,7 @@
                 <w:szCs w:val="22"/>
                 <w:lang w:val="id-ID"/>
               </w:rPr>
-              <w:t xml:space="preserve">Operator enggan migrasi (tarif dan kepastian hukum)</w:t>
+              <w:t xml:space="preserve">(17) Operator enggan migrasi (tarif dan kepastian hukum)</w:t>
             </w:r>
           </w:p>
         </w:tc>
@@ -3092,7 +3092,7 @@
                 <w:szCs w:val="22"/>
                 <w:lang w:val="id-ID"/>
               </w:rPr>
-              <w:t xml:space="preserve">Koordinasi pusat–daerah dan antarpemilik jaringan lemah</w:t>
+              <w:t xml:space="preserve">(18) Koordinasi pusat–daerah dan antarpemilik jaringan lemah</w:t>
             </w:r>
           </w:p>
         </w:tc>
@@ -3157,7 +3157,7 @@
                 <w:szCs w:val="22"/>
                 <w:lang w:val="id-ID"/>
               </w:rPr>
-              <w:t xml:space="preserve">Kota padat, kabel semrawut, galian berulang</w:t>
+              <w:t xml:space="preserve">(19) Kota padat, kabel semrawut, galian berulang</w:t>
             </w:r>
           </w:p>
         </w:tc>
@@ -3232,7 +3232,8 @@
     </w:p>
     <w:p>
       <w:pPr>
-        <w:spacing w:after="120" w:before="0" w:line="360"/>
+        <w:keepNext/>
+        <w:spacing w:after="60" w:before="0" w:line="360"/>
         <w:jc w:val="both"/>
       </w:pPr>
       <w:r>
@@ -3242,7 +3243,7 @@
           <w:szCs w:val="24"/>
           <w:lang w:val="id-ID"/>
         </w:rPr>
-        <w:t xml:space="preserve">Sembilan belas penyebab pada diagram </w:t>
+        <w:t xml:space="preserve">Sebelum dinilai, sembilan belas penyebab pada diagram </w:t>
       </w:r>
       <w:r>
         <w:rPr>
@@ -3262,7 +3263,38 @@
           <w:szCs w:val="24"/>
           <w:lang w:val="id-ID"/>
         </w:rPr>
-        <w:t xml:space="preserve"> dikelompokkan menjadi lima masalah pokok, lalu dinilai dengan kriteria </w:t>
+        <w:t xml:space="preserve"> dikelompokkan menjadi lima masalah pokok dengan tiga aturan berikut.</w:t>
+      </w:r>
+    </w:p>
+    <w:p>
+      <w:pPr>
+        <w:pStyle w:val="ListParagraph"/>
+        <w:numPr>
+          <w:ilvl w:val="0"/>
+          <w:numId w:val="2"/>
+        </w:numPr>
+        <w:spacing w:after="60" w:before="0" w:line="360"/>
+        <w:jc w:val="both"/>
+      </w:pPr>
+      <w:r>
+        <w:rPr>
+          <w:rFonts w:ascii="Arial" w:cs="Arial" w:eastAsia="Arial" w:hAnsi="Arial"/>
+          <w:b/>
+          <w:bCs/>
+          <w:sz w:val="24"/>
+          <w:szCs w:val="24"/>
+          <w:lang w:val="id-ID"/>
+        </w:rPr>
+        <w:t xml:space="preserve">Kesamaan akar (prinsip afinitas).</w:t>
+      </w:r>
+      <w:r>
+        <w:rPr>
+          <w:rFonts w:ascii="Arial" w:cs="Arial" w:eastAsia="Arial" w:hAnsi="Arial"/>
+          <w:sz w:val="24"/>
+          <w:szCs w:val="24"/>
+          <w:lang w:val="id-ID"/>
+        </w:rPr>
+        <w:t xml:space="preserve"> Penyebab yang bermuara pada kelemahan yang sama—sehingga membutuhkan jenis intervensi yang sama—digabung menjadi satu masalah pokok, walaupun berasal dari kategori 6M yang berbeda. Kategori 6M menunjukkan </w:t>
       </w:r>
       <w:r>
         <w:rPr>
@@ -3273,16 +3305,16 @@
           <w:szCs w:val="24"/>
           <w:lang w:val="id-ID"/>
         </w:rPr>
-        <w:t xml:space="preserve">Urgency</w:t>
-      </w:r>
-      <w:r>
-        <w:rPr>
-          <w:rFonts w:ascii="Arial" w:cs="Arial" w:eastAsia="Arial" w:hAnsi="Arial"/>
-          <w:sz w:val="24"/>
-          <w:szCs w:val="24"/>
-          <w:lang w:val="id-ID"/>
-        </w:rPr>
-        <w:t xml:space="preserve"> (tingkat kemendesakan), </w:t>
+        <w:t xml:space="preserve">di mana</w:t>
+      </w:r>
+      <w:r>
+        <w:rPr>
+          <w:rFonts w:ascii="Arial" w:cs="Arial" w:eastAsia="Arial" w:hAnsi="Arial"/>
+          <w:sz w:val="24"/>
+          <w:szCs w:val="24"/>
+          <w:lang w:val="id-ID"/>
+        </w:rPr>
+        <w:t xml:space="preserve"> penyebab muncul, sedangkan masalah pokok menunjukkan </w:t>
       </w:r>
       <w:r>
         <w:rPr>
@@ -3293,36 +3325,78 @@
           <w:szCs w:val="24"/>
           <w:lang w:val="id-ID"/>
         </w:rPr>
-        <w:t xml:space="preserve">Seriousness</w:t>
-      </w:r>
-      <w:r>
-        <w:rPr>
-          <w:rFonts w:ascii="Arial" w:cs="Arial" w:eastAsia="Arial" w:hAnsi="Arial"/>
-          <w:sz w:val="24"/>
-          <w:szCs w:val="24"/>
-          <w:lang w:val="id-ID"/>
-        </w:rPr>
-        <w:t xml:space="preserve"> (tingkat keseriusan dampak terhadap masalah utama), dan </w:t>
-      </w:r>
-      <w:r>
-        <w:rPr>
-          <w:rFonts w:ascii="Arial" w:cs="Arial" w:eastAsia="Arial" w:hAnsi="Arial"/>
-          <w:i/>
-          <w:iCs/>
-          <w:sz w:val="24"/>
-          <w:szCs w:val="24"/>
-          <w:lang w:val="id-ID"/>
-        </w:rPr>
-        <w:t xml:space="preserve">Growth</w:t>
-      </w:r>
-      <w:r>
-        <w:rPr>
-          <w:rFonts w:ascii="Arial" w:cs="Arial" w:eastAsia="Arial" w:hAnsi="Arial"/>
-          <w:sz w:val="24"/>
-          <w:szCs w:val="24"/>
-          <w:lang w:val="id-ID"/>
-        </w:rPr>
-        <w:t xml:space="preserve"> (kecenderungan memburuk bila dibiarkan).</w:t>
+        <w:t xml:space="preserve">apa</w:t>
+      </w:r>
+      <w:r>
+        <w:rPr>
+          <w:rFonts w:ascii="Arial" w:cs="Arial" w:eastAsia="Arial" w:hAnsi="Arial"/>
+          <w:sz w:val="24"/>
+          <w:szCs w:val="24"/>
+          <w:lang w:val="id-ID"/>
+        </w:rPr>
+        <w:t xml:space="preserve"> kelemahan mendasarnya.</w:t>
+      </w:r>
+    </w:p>
+    <w:p>
+      <w:pPr>
+        <w:pStyle w:val="ListParagraph"/>
+        <w:numPr>
+          <w:ilvl w:val="0"/>
+          <w:numId w:val="2"/>
+        </w:numPr>
+        <w:spacing w:after="60" w:before="0" w:line="360"/>
+        <w:jc w:val="both"/>
+      </w:pPr>
+      <w:r>
+        <w:rPr>
+          <w:rFonts w:ascii="Arial" w:cs="Arial" w:eastAsia="Arial" w:hAnsi="Arial"/>
+          <w:b/>
+          <w:bCs/>
+          <w:sz w:val="24"/>
+          <w:szCs w:val="24"/>
+          <w:lang w:val="id-ID"/>
+        </w:rPr>
+        <w:t xml:space="preserve">Satu penyebab, satu kelompok.</w:t>
+      </w:r>
+      <w:r>
+        <w:rPr>
+          <w:rFonts w:ascii="Arial" w:cs="Arial" w:eastAsia="Arial" w:hAnsi="Arial"/>
+          <w:sz w:val="24"/>
+          <w:szCs w:val="24"/>
+          <w:lang w:val="id-ID"/>
+        </w:rPr>
+        <w:t xml:space="preserve"> Penyebab yang bersinggungan dengan lebih dari satu kelompok ditempatkan pada kelompok yang paling menentukan solusinya, sehingga tidak ada penyebab yang dihitung ganda atau terlewat.</w:t>
+      </w:r>
+    </w:p>
+    <w:p>
+      <w:pPr>
+        <w:pStyle w:val="ListParagraph"/>
+        <w:numPr>
+          <w:ilvl w:val="0"/>
+          <w:numId w:val="2"/>
+        </w:numPr>
+        <w:spacing w:after="60" w:before="0" w:line="360"/>
+        <w:jc w:val="both"/>
+      </w:pPr>
+      <w:r>
+        <w:rPr>
+          <w:rFonts w:ascii="Arial" w:cs="Arial" w:eastAsia="Arial" w:hAnsi="Arial"/>
+          <w:b/>
+          <w:bCs/>
+          <w:sz w:val="24"/>
+          <w:szCs w:val="24"/>
+          <w:lang w:val="id-ID"/>
+        </w:rPr>
+        <w:t xml:space="preserve">Uji silang dengan temuan Ombudsman.</w:t>
+      </w:r>
+      <w:r>
+        <w:rPr>
+          <w:rFonts w:ascii="Arial" w:cs="Arial" w:eastAsia="Arial" w:hAnsi="Arial"/>
+          <w:sz w:val="24"/>
+          <w:szCs w:val="24"/>
+          <w:lang w:val="id-ID"/>
+        </w:rPr>
+        <w:t xml:space="preserve"> Kejanggalan kedua sampai kelima harus terwakili seluruhnya. Kejanggalan kelima dipecah menjadi dua masalah pokok (tarif serta panduan teknis dan koordinasi) karena solusinya berbeda: yang satu bersifat ekonomi, yang lain bersifat standardisasi.</w:t>
       </w:r>
     </w:p>
     <w:p>
@@ -3340,7 +3414,1065 @@
           <w:szCs w:val="22"/>
           <w:lang w:val="id-ID"/>
         </w:rPr>
-        <w:t xml:space="preserve">Tabel 3. Analisis USG terhadap Masalah Pokok</w:t>
+        <w:t xml:space="preserve">Tabel 3. Pengelompokan Penyebab menjadi Masalah Pokok</w:t>
+      </w:r>
+    </w:p>
+    <w:tbl>
+      <w:tblPr>
+        <w:tblW w:type="dxa" w:w="8787"/>
+        <w:tblBorders>
+          <w:top w:val="single" w:color="000000" w:sz="4"/>
+          <w:left w:val="single" w:color="000000" w:sz="4"/>
+          <w:bottom w:val="single" w:color="000000" w:sz="4"/>
+          <w:right w:val="single" w:color="000000" w:sz="4"/>
+          <w:insideH w:val="single" w:color="000000" w:sz="4"/>
+          <w:insideV w:val="single" w:color="000000" w:sz="4"/>
+        </w:tblBorders>
+        <w:tblLayout w:type="fixed"/>
+      </w:tblPr>
+      <w:tblGrid>
+        <w:gridCol w:w="560"/>
+        <w:gridCol w:w="2600"/>
+        <w:gridCol w:w="3877"/>
+        <w:gridCol w:w="1750"/>
+      </w:tblGrid>
+      <w:tr>
+        <w:trPr>
+          <w:cantSplit/>
+          <w:tblHeader/>
+        </w:trPr>
+        <w:tc>
+          <w:tcPr>
+            <w:tcW w:type="dxa" w:w="560"/>
+            <w:shd w:fill="D9E2F3" w:color="auto" w:val="clear"/>
+            <w:tcMar>
+              <w:top w:type="dxa" w:w="40"/>
+              <w:left w:type="dxa" w:w="90"/>
+              <w:bottom w:type="dxa" w:w="40"/>
+              <w:right w:type="dxa" w:w="90"/>
+            </w:tcMar>
+            <w:vAlign w:val="center"/>
+          </w:tcPr>
+          <w:p>
+            <w:pPr>
+              <w:spacing w:after="40" w:before="40" w:line="240"/>
+              <w:jc w:val="center"/>
+            </w:pPr>
+            <w:r>
+              <w:rPr>
+                <w:rFonts w:ascii="Arial" w:cs="Arial" w:eastAsia="Arial" w:hAnsi="Arial"/>
+                <w:b/>
+                <w:bCs/>
+                <w:sz w:val="22"/>
+                <w:szCs w:val="22"/>
+                <w:lang w:val="id-ID"/>
+              </w:rPr>
+              <w:t xml:space="preserve">No</w:t>
+            </w:r>
+          </w:p>
+        </w:tc>
+        <w:tc>
+          <w:tcPr>
+            <w:tcW w:type="dxa" w:w="2600"/>
+            <w:shd w:fill="D9E2F3" w:color="auto" w:val="clear"/>
+            <w:tcMar>
+              <w:top w:type="dxa" w:w="40"/>
+              <w:left w:type="dxa" w:w="90"/>
+              <w:bottom w:type="dxa" w:w="40"/>
+              <w:right w:type="dxa" w:w="90"/>
+            </w:tcMar>
+            <w:vAlign w:val="center"/>
+          </w:tcPr>
+          <w:p>
+            <w:pPr>
+              <w:spacing w:after="40" w:before="40" w:line="240"/>
+              <w:jc w:val="center"/>
+            </w:pPr>
+            <w:r>
+              <w:rPr>
+                <w:rFonts w:ascii="Arial" w:cs="Arial" w:eastAsia="Arial" w:hAnsi="Arial"/>
+                <w:b/>
+                <w:bCs/>
+                <w:sz w:val="22"/>
+                <w:szCs w:val="22"/>
+                <w:lang w:val="id-ID"/>
+              </w:rPr>
+              <w:t xml:space="preserve">Masalah Pokok</w:t>
+            </w:r>
+          </w:p>
+        </w:tc>
+        <w:tc>
+          <w:tcPr>
+            <w:tcW w:type="dxa" w:w="3877"/>
+            <w:shd w:fill="D9E2F3" w:color="auto" w:val="clear"/>
+            <w:tcMar>
+              <w:top w:type="dxa" w:w="40"/>
+              <w:left w:type="dxa" w:w="90"/>
+              <w:bottom w:type="dxa" w:w="40"/>
+              <w:right w:type="dxa" w:w="90"/>
+            </w:tcMar>
+            <w:vAlign w:val="center"/>
+          </w:tcPr>
+          <w:p>
+            <w:pPr>
+              <w:spacing w:after="40" w:before="40" w:line="240"/>
+              <w:jc w:val="center"/>
+            </w:pPr>
+            <w:r>
+              <w:rPr>
+                <w:rFonts w:ascii="Arial" w:cs="Arial" w:eastAsia="Arial" w:hAnsi="Arial"/>
+                <w:b/>
+                <w:bCs/>
+                <w:sz w:val="22"/>
+                <w:szCs w:val="22"/>
+                <w:lang w:val="id-ID"/>
+              </w:rPr>
+              <w:t xml:space="preserve">Penyebab yang Dikelompokkan (nomor pada Gambar 1/Tabel 2)</w:t>
+            </w:r>
+          </w:p>
+        </w:tc>
+        <w:tc>
+          <w:tcPr>
+            <w:tcW w:type="dxa" w:w="1750"/>
+            <w:shd w:fill="D9E2F3" w:color="auto" w:val="clear"/>
+            <w:tcMar>
+              <w:top w:type="dxa" w:w="40"/>
+              <w:left w:type="dxa" w:w="90"/>
+              <w:bottom w:type="dxa" w:w="40"/>
+              <w:right w:type="dxa" w:w="90"/>
+            </w:tcMar>
+            <w:vAlign w:val="center"/>
+          </w:tcPr>
+          <w:p>
+            <w:pPr>
+              <w:spacing w:after="40" w:before="40" w:line="240"/>
+              <w:jc w:val="center"/>
+            </w:pPr>
+            <w:r>
+              <w:rPr>
+                <w:rFonts w:ascii="Arial" w:cs="Arial" w:eastAsia="Arial" w:hAnsi="Arial"/>
+                <w:b/>
+                <w:bCs/>
+                <w:sz w:val="22"/>
+                <w:szCs w:val="22"/>
+                <w:lang w:val="id-ID"/>
+              </w:rPr>
+              <w:t xml:space="preserve">Asal Kategori 6M</w:t>
+            </w:r>
+          </w:p>
+        </w:tc>
+      </w:tr>
+      <w:tr>
+        <w:trPr>
+          <w:cantSplit/>
+        </w:trPr>
+        <w:tc>
+          <w:tcPr>
+            <w:tcW w:type="dxa" w:w="560"/>
+            <w:tcMar>
+              <w:top w:type="dxa" w:w="40"/>
+              <w:left w:type="dxa" w:w="90"/>
+              <w:bottom w:type="dxa" w:w="40"/>
+              <w:right w:type="dxa" w:w="90"/>
+            </w:tcMar>
+            <w:vAlign w:val="center"/>
+          </w:tcPr>
+          <w:p>
+            <w:pPr>
+              <w:spacing w:after="40" w:before="40" w:line="240"/>
+              <w:jc w:val="center"/>
+            </w:pPr>
+            <w:r>
+              <w:rPr>
+                <w:rFonts w:ascii="Arial" w:cs="Arial" w:eastAsia="Arial" w:hAnsi="Arial"/>
+                <w:sz w:val="22"/>
+                <w:szCs w:val="22"/>
+                <w:lang w:val="id-ID"/>
+              </w:rPr>
+              <w:t xml:space="preserve">1</w:t>
+            </w:r>
+          </w:p>
+        </w:tc>
+        <w:tc>
+          <w:tcPr>
+            <w:tcW w:type="dxa" w:w="2600"/>
+            <w:tcMar>
+              <w:top w:type="dxa" w:w="40"/>
+              <w:left w:type="dxa" w:w="90"/>
+              <w:bottom w:type="dxa" w:w="40"/>
+              <w:right w:type="dxa" w:w="90"/>
+            </w:tcMar>
+            <w:vAlign w:val="center"/>
+          </w:tcPr>
+          <w:p>
+            <w:pPr>
+              <w:spacing w:after="40" w:before="40" w:line="240"/>
+              <w:jc w:val="left"/>
+            </w:pPr>
+            <w:r>
+              <w:rPr>
+                <w:rFonts w:ascii="Arial" w:cs="Arial" w:eastAsia="Arial" w:hAnsi="Arial"/>
+                <w:sz w:val="22"/>
+                <w:szCs w:val="22"/>
+                <w:lang w:val="id-ID"/>
+              </w:rPr>
+              <w:t xml:space="preserve">Belum ada sistem perencanaan dan pengendalian SJUT yang terpadu dan berbasis data</w:t>
+            </w:r>
+          </w:p>
+        </w:tc>
+        <w:tc>
+          <w:tcPr>
+            <w:tcW w:type="dxa" w:w="3877"/>
+            <w:tcMar>
+              <w:top w:type="dxa" w:w="40"/>
+              <w:left w:type="dxa" w:w="90"/>
+              <w:bottom w:type="dxa" w:w="40"/>
+              <w:right w:type="dxa" w:w="90"/>
+            </w:tcMar>
+            <w:vAlign w:val="center"/>
+          </w:tcPr>
+          <w:p>
+            <w:pPr>
+              <w:spacing w:after="40" w:before="40" w:line="240"/>
+              <w:jc w:val="left"/>
+            </w:pPr>
+            <w:r>
+              <w:rPr>
+                <w:rFonts w:ascii="Arial" w:cs="Arial" w:eastAsia="Arial" w:hAnsi="Arial"/>
+                <w:sz w:val="22"/>
+                <w:szCs w:val="22"/>
+                <w:lang w:val="id-ID"/>
+              </w:rPr>
+              <w:t xml:space="preserve">(1) tidak ada </w:t>
+            </w:r>
+            <w:r>
+              <w:rPr>
+                <w:rFonts w:ascii="Arial" w:cs="Arial" w:eastAsia="Arial" w:hAnsi="Arial"/>
+                <w:i/>
+                <w:iCs/>
+                <w:sz w:val="22"/>
+                <w:szCs w:val="22"/>
+                <w:lang w:val="id-ID"/>
+              </w:rPr>
+              <w:t xml:space="preserve">leading sector</w:t>
+            </w:r>
+            <w:r>
+              <w:rPr>
+                <w:rFonts w:ascii="Arial" w:cs="Arial" w:eastAsia="Arial" w:hAnsi="Arial"/>
+                <w:sz w:val="22"/>
+                <w:szCs w:val="22"/>
+                <w:lang w:val="id-ID"/>
+              </w:rPr>
+              <w:t xml:space="preserve">/PMO; (2) kapasitas dan komitmen BUMD rendah; (3) pengawasan atas BUMD lemah; (5) belum ada rencana induk; (6) tidak ada monev dan KPI; (14) belum ada peta digital utilitas; (15) belum ada dasbor dan peringatan dini</w:t>
+            </w:r>
+          </w:p>
+        </w:tc>
+        <w:tc>
+          <w:tcPr>
+            <w:tcW w:type="dxa" w:w="1750"/>
+            <w:tcMar>
+              <w:top w:type="dxa" w:w="40"/>
+              <w:left w:type="dxa" w:w="90"/>
+              <w:bottom w:type="dxa" w:w="40"/>
+              <w:right w:type="dxa" w:w="90"/>
+            </w:tcMar>
+            <w:vAlign w:val="center"/>
+          </w:tcPr>
+          <w:p>
+            <w:pPr>
+              <w:spacing w:after="40" w:before="40" w:line="240"/>
+              <w:jc w:val="left"/>
+            </w:pPr>
+            <w:r>
+              <w:rPr>
+                <w:rFonts w:ascii="Arial" w:cs="Arial" w:eastAsia="Arial" w:hAnsi="Arial"/>
+                <w:i/>
+                <w:iCs/>
+                <w:sz w:val="22"/>
+                <w:szCs w:val="22"/>
+                <w:lang w:val="id-ID"/>
+              </w:rPr>
+              <w:t xml:space="preserve">Man</w:t>
+            </w:r>
+            <w:r>
+              <w:rPr>
+                <w:rFonts w:ascii="Arial" w:cs="Arial" w:eastAsia="Arial" w:hAnsi="Arial"/>
+                <w:sz w:val="22"/>
+                <w:szCs w:val="22"/>
+                <w:lang w:val="id-ID"/>
+              </w:rPr>
+              <w:t xml:space="preserve">, </w:t>
+            </w:r>
+            <w:r>
+              <w:rPr>
+                <w:rFonts w:ascii="Arial" w:cs="Arial" w:eastAsia="Arial" w:hAnsi="Arial"/>
+                <w:i/>
+                <w:iCs/>
+                <w:sz w:val="22"/>
+                <w:szCs w:val="22"/>
+                <w:lang w:val="id-ID"/>
+              </w:rPr>
+              <w:t xml:space="preserve">Method</w:t>
+            </w:r>
+            <w:r>
+              <w:rPr>
+                <w:rFonts w:ascii="Arial" w:cs="Arial" w:eastAsia="Arial" w:hAnsi="Arial"/>
+                <w:sz w:val="22"/>
+                <w:szCs w:val="22"/>
+                <w:lang w:val="id-ID"/>
+              </w:rPr>
+              <w:t xml:space="preserve">, </w:t>
+            </w:r>
+            <w:r>
+              <w:rPr>
+                <w:rFonts w:ascii="Arial" w:cs="Arial" w:eastAsia="Arial" w:hAnsi="Arial"/>
+                <w:i/>
+                <w:iCs/>
+                <w:sz w:val="22"/>
+                <w:szCs w:val="22"/>
+                <w:lang w:val="id-ID"/>
+              </w:rPr>
+              <w:t xml:space="preserve">Machine</w:t>
+            </w:r>
+            <w:r>
+              <w:rPr>
+                <w:rFonts w:ascii="Arial" w:cs="Arial" w:eastAsia="Arial" w:hAnsi="Arial"/>
+                <w:sz w:val="22"/>
+                <w:szCs w:val="22"/>
+                <w:lang w:val="id-ID"/>
+              </w:rPr>
+              <w:t xml:space="preserve"> (7 penyebab)</w:t>
+            </w:r>
+          </w:p>
+        </w:tc>
+      </w:tr>
+      <w:tr>
+        <w:trPr>
+          <w:cantSplit/>
+        </w:trPr>
+        <w:tc>
+          <w:tcPr>
+            <w:tcW w:type="dxa" w:w="560"/>
+            <w:tcMar>
+              <w:top w:type="dxa" w:w="40"/>
+              <w:left w:type="dxa" w:w="90"/>
+              <w:bottom w:type="dxa" w:w="40"/>
+              <w:right w:type="dxa" w:w="90"/>
+            </w:tcMar>
+            <w:vAlign w:val="center"/>
+          </w:tcPr>
+          <w:p>
+            <w:pPr>
+              <w:spacing w:after="40" w:before="40" w:line="240"/>
+              <w:jc w:val="center"/>
+            </w:pPr>
+            <w:r>
+              <w:rPr>
+                <w:rFonts w:ascii="Arial" w:cs="Arial" w:eastAsia="Arial" w:hAnsi="Arial"/>
+                <w:sz w:val="22"/>
+                <w:szCs w:val="22"/>
+                <w:lang w:val="id-ID"/>
+              </w:rPr>
+              <w:t xml:space="preserve">2</w:t>
+            </w:r>
+          </w:p>
+        </w:tc>
+        <w:tc>
+          <w:tcPr>
+            <w:tcW w:type="dxa" w:w="2600"/>
+            <w:tcMar>
+              <w:top w:type="dxa" w:w="40"/>
+              <w:left w:type="dxa" w:w="90"/>
+              <w:bottom w:type="dxa" w:w="40"/>
+              <w:right w:type="dxa" w:w="90"/>
+            </w:tcMar>
+            <w:vAlign w:val="center"/>
+          </w:tcPr>
+          <w:p>
+            <w:pPr>
+              <w:spacing w:after="40" w:before="40" w:line="240"/>
+              <w:jc w:val="left"/>
+            </w:pPr>
+            <w:r>
+              <w:rPr>
+                <w:rFonts w:ascii="Arial" w:cs="Arial" w:eastAsia="Arial" w:hAnsi="Arial"/>
+                <w:sz w:val="22"/>
+                <w:szCs w:val="22"/>
+                <w:lang w:val="id-ID"/>
+              </w:rPr>
+              <w:t xml:space="preserve">Kekosongan payung hukum penugasan tanpa evaluasi progres</w:t>
+            </w:r>
+          </w:p>
+        </w:tc>
+        <w:tc>
+          <w:tcPr>
+            <w:tcW w:type="dxa" w:w="3877"/>
+            <w:tcMar>
+              <w:top w:type="dxa" w:w="40"/>
+              <w:left w:type="dxa" w:w="90"/>
+              <w:bottom w:type="dxa" w:w="40"/>
+              <w:right w:type="dxa" w:w="90"/>
+            </w:tcMar>
+            <w:vAlign w:val="center"/>
+          </w:tcPr>
+          <w:p>
+            <w:pPr>
+              <w:spacing w:after="40" w:before="40" w:line="240"/>
+              <w:jc w:val="left"/>
+            </w:pPr>
+            <w:r>
+              <w:rPr>
+                <w:rFonts w:ascii="Arial" w:cs="Arial" w:eastAsia="Arial" w:hAnsi="Arial"/>
+                <w:sz w:val="22"/>
+                <w:szCs w:val="22"/>
+                <w:lang w:val="id-ID"/>
+              </w:rPr>
+              <w:t xml:space="preserve">(4) regulasi penugasan habis tanpa pengganti dan evaluasi</w:t>
+            </w:r>
+          </w:p>
+        </w:tc>
+        <w:tc>
+          <w:tcPr>
+            <w:tcW w:type="dxa" w:w="1750"/>
+            <w:tcMar>
+              <w:top w:type="dxa" w:w="40"/>
+              <w:left w:type="dxa" w:w="90"/>
+              <w:bottom w:type="dxa" w:w="40"/>
+              <w:right w:type="dxa" w:w="90"/>
+            </w:tcMar>
+            <w:vAlign w:val="center"/>
+          </w:tcPr>
+          <w:p>
+            <w:pPr>
+              <w:spacing w:after="40" w:before="40" w:line="240"/>
+              <w:jc w:val="left"/>
+            </w:pPr>
+            <w:r>
+              <w:rPr>
+                <w:rFonts w:ascii="Arial" w:cs="Arial" w:eastAsia="Arial" w:hAnsi="Arial"/>
+                <w:i/>
+                <w:iCs/>
+                <w:sz w:val="22"/>
+                <w:szCs w:val="22"/>
+                <w:lang w:val="id-ID"/>
+              </w:rPr>
+              <w:t xml:space="preserve">Method</w:t>
+            </w:r>
+            <w:r>
+              <w:rPr>
+                <w:rFonts w:ascii="Arial" w:cs="Arial" w:eastAsia="Arial" w:hAnsi="Arial"/>
+                <w:sz w:val="22"/>
+                <w:szCs w:val="22"/>
+                <w:lang w:val="id-ID"/>
+              </w:rPr>
+              <w:t xml:space="preserve"> (1 penyebab)</w:t>
+            </w:r>
+          </w:p>
+        </w:tc>
+      </w:tr>
+      <w:tr>
+        <w:trPr>
+          <w:cantSplit/>
+        </w:trPr>
+        <w:tc>
+          <w:tcPr>
+            <w:tcW w:type="dxa" w:w="560"/>
+            <w:tcMar>
+              <w:top w:type="dxa" w:w="40"/>
+              <w:left w:type="dxa" w:w="90"/>
+              <w:bottom w:type="dxa" w:w="40"/>
+              <w:right w:type="dxa" w:w="90"/>
+            </w:tcMar>
+            <w:vAlign w:val="center"/>
+          </w:tcPr>
+          <w:p>
+            <w:pPr>
+              <w:spacing w:after="40" w:before="40" w:line="240"/>
+              <w:jc w:val="center"/>
+            </w:pPr>
+            <w:r>
+              <w:rPr>
+                <w:rFonts w:ascii="Arial" w:cs="Arial" w:eastAsia="Arial" w:hAnsi="Arial"/>
+                <w:sz w:val="22"/>
+                <w:szCs w:val="22"/>
+                <w:lang w:val="id-ID"/>
+              </w:rPr>
+              <w:t xml:space="preserve">3</w:t>
+            </w:r>
+          </w:p>
+        </w:tc>
+        <w:tc>
+          <w:tcPr>
+            <w:tcW w:type="dxa" w:w="2600"/>
+            <w:tcMar>
+              <w:top w:type="dxa" w:w="40"/>
+              <w:left w:type="dxa" w:w="90"/>
+              <w:bottom w:type="dxa" w:w="40"/>
+              <w:right w:type="dxa" w:w="90"/>
+            </w:tcMar>
+            <w:vAlign w:val="center"/>
+          </w:tcPr>
+          <w:p>
+            <w:pPr>
+              <w:spacing w:after="40" w:before="40" w:line="240"/>
+              <w:jc w:val="left"/>
+            </w:pPr>
+            <w:r>
+              <w:rPr>
+                <w:rFonts w:ascii="Arial" w:cs="Arial" w:eastAsia="Arial" w:hAnsi="Arial"/>
+                <w:sz w:val="22"/>
+                <w:szCs w:val="22"/>
+                <w:lang w:val="id-ID"/>
+              </w:rPr>
+              <w:t xml:space="preserve">Kabel bekas dan limbah tidak terkelola; penanganan reaktif</w:t>
+            </w:r>
+          </w:p>
+        </w:tc>
+        <w:tc>
+          <w:tcPr>
+            <w:tcW w:type="dxa" w:w="3877"/>
+            <w:tcMar>
+              <w:top w:type="dxa" w:w="40"/>
+              <w:left w:type="dxa" w:w="90"/>
+              <w:bottom w:type="dxa" w:w="40"/>
+              <w:right w:type="dxa" w:w="90"/>
+            </w:tcMar>
+            <w:vAlign w:val="center"/>
+          </w:tcPr>
+          <w:p>
+            <w:pPr>
+              <w:spacing w:after="40" w:before="40" w:line="240"/>
+              <w:jc w:val="left"/>
+            </w:pPr>
+            <w:r>
+              <w:rPr>
+                <w:rFonts w:ascii="Arial" w:cs="Arial" w:eastAsia="Arial" w:hAnsi="Arial"/>
+                <w:sz w:val="22"/>
+                <w:szCs w:val="22"/>
+                <w:lang w:val="id-ID"/>
+              </w:rPr>
+              <w:t xml:space="preserve">(11) kabel bekas dan limbah tidak dikelola; (12) belum ada regulasi limbah kabel; (13) inventaris jaringan eksisting tidak ada; (16) kanal aduan tidak terhubung ke pemilik kabel</w:t>
+            </w:r>
+          </w:p>
+        </w:tc>
+        <w:tc>
+          <w:tcPr>
+            <w:tcW w:type="dxa" w:w="1750"/>
+            <w:tcMar>
+              <w:top w:type="dxa" w:w="40"/>
+              <w:left w:type="dxa" w:w="90"/>
+              <w:bottom w:type="dxa" w:w="40"/>
+              <w:right w:type="dxa" w:w="90"/>
+            </w:tcMar>
+            <w:vAlign w:val="center"/>
+          </w:tcPr>
+          <w:p>
+            <w:pPr>
+              <w:spacing w:after="40" w:before="40" w:line="240"/>
+              <w:jc w:val="left"/>
+            </w:pPr>
+            <w:r>
+              <w:rPr>
+                <w:rFonts w:ascii="Arial" w:cs="Arial" w:eastAsia="Arial" w:hAnsi="Arial"/>
+                <w:i/>
+                <w:iCs/>
+                <w:sz w:val="22"/>
+                <w:szCs w:val="22"/>
+                <w:lang w:val="id-ID"/>
+              </w:rPr>
+              <w:t xml:space="preserve">Material</w:t>
+            </w:r>
+            <w:r>
+              <w:rPr>
+                <w:rFonts w:ascii="Arial" w:cs="Arial" w:eastAsia="Arial" w:hAnsi="Arial"/>
+                <w:sz w:val="22"/>
+                <w:szCs w:val="22"/>
+                <w:lang w:val="id-ID"/>
+              </w:rPr>
+              <w:t xml:space="preserve">, </w:t>
+            </w:r>
+            <w:r>
+              <w:rPr>
+                <w:rFonts w:ascii="Arial" w:cs="Arial" w:eastAsia="Arial" w:hAnsi="Arial"/>
+                <w:i/>
+                <w:iCs/>
+                <w:sz w:val="22"/>
+                <w:szCs w:val="22"/>
+                <w:lang w:val="id-ID"/>
+              </w:rPr>
+              <w:t xml:space="preserve">Machine</w:t>
+            </w:r>
+            <w:r>
+              <w:rPr>
+                <w:rFonts w:ascii="Arial" w:cs="Arial" w:eastAsia="Arial" w:hAnsi="Arial"/>
+                <w:sz w:val="22"/>
+                <w:szCs w:val="22"/>
+                <w:lang w:val="id-ID"/>
+              </w:rPr>
+              <w:t xml:space="preserve"> (4 penyebab)</w:t>
+            </w:r>
+          </w:p>
+        </w:tc>
+      </w:tr>
+      <w:tr>
+        <w:trPr>
+          <w:cantSplit/>
+        </w:trPr>
+        <w:tc>
+          <w:tcPr>
+            <w:tcW w:type="dxa" w:w="560"/>
+            <w:tcMar>
+              <w:top w:type="dxa" w:w="40"/>
+              <w:left w:type="dxa" w:w="90"/>
+              <w:bottom w:type="dxa" w:w="40"/>
+              <w:right w:type="dxa" w:w="90"/>
+            </w:tcMar>
+            <w:vAlign w:val="center"/>
+          </w:tcPr>
+          <w:p>
+            <w:pPr>
+              <w:spacing w:after="40" w:before="40" w:line="240"/>
+              <w:jc w:val="center"/>
+            </w:pPr>
+            <w:r>
+              <w:rPr>
+                <w:rFonts w:ascii="Arial" w:cs="Arial" w:eastAsia="Arial" w:hAnsi="Arial"/>
+                <w:sz w:val="22"/>
+                <w:szCs w:val="22"/>
+                <w:lang w:val="id-ID"/>
+              </w:rPr>
+              <w:t xml:space="preserve">4</w:t>
+            </w:r>
+          </w:p>
+        </w:tc>
+        <w:tc>
+          <w:tcPr>
+            <w:tcW w:type="dxa" w:w="2600"/>
+            <w:tcMar>
+              <w:top w:type="dxa" w:w="40"/>
+              <w:left w:type="dxa" w:w="90"/>
+              <w:bottom w:type="dxa" w:w="40"/>
+              <w:right w:type="dxa" w:w="90"/>
+            </w:tcMar>
+            <w:vAlign w:val="center"/>
+          </w:tcPr>
+          <w:p>
+            <w:pPr>
+              <w:spacing w:after="40" w:before="40" w:line="240"/>
+              <w:jc w:val="left"/>
+            </w:pPr>
+            <w:r>
+              <w:rPr>
+                <w:rFonts w:ascii="Arial" w:cs="Arial" w:eastAsia="Arial" w:hAnsi="Arial"/>
+                <w:sz w:val="22"/>
+                <w:szCs w:val="22"/>
+                <w:lang w:val="id-ID"/>
+              </w:rPr>
+              <w:t xml:space="preserve">Tarif sewa tidak transparan dan belum ada insentif migrasi bagi operator</w:t>
+            </w:r>
+          </w:p>
+        </w:tc>
+        <w:tc>
+          <w:tcPr>
+            <w:tcW w:type="dxa" w:w="3877"/>
+            <w:tcMar>
+              <w:top w:type="dxa" w:w="40"/>
+              <w:left w:type="dxa" w:w="90"/>
+              <w:bottom w:type="dxa" w:w="40"/>
+              <w:right w:type="dxa" w:w="90"/>
+            </w:tcMar>
+            <w:vAlign w:val="center"/>
+          </w:tcPr>
+          <w:p>
+            <w:pPr>
+              <w:spacing w:after="40" w:before="40" w:line="240"/>
+              <w:jc w:val="left"/>
+            </w:pPr>
+            <w:r>
+              <w:rPr>
+                <w:rFonts w:ascii="Arial" w:cs="Arial" w:eastAsia="Arial" w:hAnsi="Arial"/>
+                <w:sz w:val="22"/>
+                <w:szCs w:val="22"/>
+                <w:lang w:val="id-ID"/>
+              </w:rPr>
+              <w:t xml:space="preserve">(8) tarif belum transparan dan belum disepakati; (9) model bisnis BUMD tidak pasti; (10) belum ada insentif dan disinsentif; (17) operator enggan migrasi</w:t>
+            </w:r>
+          </w:p>
+        </w:tc>
+        <w:tc>
+          <w:tcPr>
+            <w:tcW w:type="dxa" w:w="1750"/>
+            <w:tcMar>
+              <w:top w:type="dxa" w:w="40"/>
+              <w:left w:type="dxa" w:w="90"/>
+              <w:bottom w:type="dxa" w:w="40"/>
+              <w:right w:type="dxa" w:w="90"/>
+            </w:tcMar>
+            <w:vAlign w:val="center"/>
+          </w:tcPr>
+          <w:p>
+            <w:pPr>
+              <w:spacing w:after="40" w:before="40" w:line="240"/>
+              <w:jc w:val="left"/>
+            </w:pPr>
+            <w:r>
+              <w:rPr>
+                <w:rFonts w:ascii="Arial" w:cs="Arial" w:eastAsia="Arial" w:hAnsi="Arial"/>
+                <w:i/>
+                <w:iCs/>
+                <w:sz w:val="22"/>
+                <w:szCs w:val="22"/>
+                <w:lang w:val="id-ID"/>
+              </w:rPr>
+              <w:t xml:space="preserve">Money</w:t>
+            </w:r>
+            <w:r>
+              <w:rPr>
+                <w:rFonts w:ascii="Arial" w:cs="Arial" w:eastAsia="Arial" w:hAnsi="Arial"/>
+                <w:sz w:val="22"/>
+                <w:szCs w:val="22"/>
+                <w:lang w:val="id-ID"/>
+              </w:rPr>
+              <w:t xml:space="preserve">, </w:t>
+            </w:r>
+            <w:r>
+              <w:rPr>
+                <w:rFonts w:ascii="Arial" w:cs="Arial" w:eastAsia="Arial" w:hAnsi="Arial"/>
+                <w:i/>
+                <w:iCs/>
+                <w:sz w:val="22"/>
+                <w:szCs w:val="22"/>
+                <w:lang w:val="id-ID"/>
+              </w:rPr>
+              <w:t xml:space="preserve">Market</w:t>
+            </w:r>
+            <w:r>
+              <w:rPr>
+                <w:rFonts w:ascii="Arial" w:cs="Arial" w:eastAsia="Arial" w:hAnsi="Arial"/>
+                <w:sz w:val="22"/>
+                <w:szCs w:val="22"/>
+                <w:lang w:val="id-ID"/>
+              </w:rPr>
+              <w:t xml:space="preserve"> (4 penyebab)</w:t>
+            </w:r>
+          </w:p>
+        </w:tc>
+      </w:tr>
+      <w:tr>
+        <w:trPr>
+          <w:cantSplit/>
+        </w:trPr>
+        <w:tc>
+          <w:tcPr>
+            <w:tcW w:type="dxa" w:w="560"/>
+            <w:tcMar>
+              <w:top w:type="dxa" w:w="40"/>
+              <w:left w:type="dxa" w:w="90"/>
+              <w:bottom w:type="dxa" w:w="40"/>
+              <w:right w:type="dxa" w:w="90"/>
+            </w:tcMar>
+            <w:vAlign w:val="center"/>
+          </w:tcPr>
+          <w:p>
+            <w:pPr>
+              <w:spacing w:after="40" w:before="40" w:line="240"/>
+              <w:jc w:val="center"/>
+            </w:pPr>
+            <w:r>
+              <w:rPr>
+                <w:rFonts w:ascii="Arial" w:cs="Arial" w:eastAsia="Arial" w:hAnsi="Arial"/>
+                <w:sz w:val="22"/>
+                <w:szCs w:val="22"/>
+                <w:lang w:val="id-ID"/>
+              </w:rPr>
+              <w:t xml:space="preserve">5</w:t>
+            </w:r>
+          </w:p>
+        </w:tc>
+        <w:tc>
+          <w:tcPr>
+            <w:tcW w:type="dxa" w:w="2600"/>
+            <w:tcMar>
+              <w:top w:type="dxa" w:w="40"/>
+              <w:left w:type="dxa" w:w="90"/>
+              <w:bottom w:type="dxa" w:w="40"/>
+              <w:right w:type="dxa" w:w="90"/>
+            </w:tcMar>
+            <w:vAlign w:val="center"/>
+          </w:tcPr>
+          <w:p>
+            <w:pPr>
+              <w:spacing w:after="40" w:before="40" w:line="240"/>
+              <w:jc w:val="left"/>
+            </w:pPr>
+            <w:r>
+              <w:rPr>
+                <w:rFonts w:ascii="Arial" w:cs="Arial" w:eastAsia="Arial" w:hAnsi="Arial"/>
+                <w:sz w:val="22"/>
+                <w:szCs w:val="22"/>
+                <w:lang w:val="id-ID"/>
+              </w:rPr>
+              <w:t xml:space="preserve">Koordinasi pusat–daerah dan antarpemilik jaringan lemah; panduan teknis SJUT belum tersedia</w:t>
+            </w:r>
+          </w:p>
+        </w:tc>
+        <w:tc>
+          <w:tcPr>
+            <w:tcW w:type="dxa" w:w="3877"/>
+            <w:tcMar>
+              <w:top w:type="dxa" w:w="40"/>
+              <w:left w:type="dxa" w:w="90"/>
+              <w:bottom w:type="dxa" w:w="40"/>
+              <w:right w:type="dxa" w:w="90"/>
+            </w:tcMar>
+            <w:vAlign w:val="center"/>
+          </w:tcPr>
+          <w:p>
+            <w:pPr>
+              <w:spacing w:after="40" w:before="40" w:line="240"/>
+              <w:jc w:val="left"/>
+            </w:pPr>
+            <w:r>
+              <w:rPr>
+                <w:rFonts w:ascii="Arial" w:cs="Arial" w:eastAsia="Arial" w:hAnsi="Arial"/>
+                <w:sz w:val="22"/>
+                <w:szCs w:val="22"/>
+                <w:lang w:val="id-ID"/>
+              </w:rPr>
+              <w:t xml:space="preserve">(7) panduan teknis SJUT nasional belum ada; (18) koordinasi pusat–daerah dan antarpemilik jaringan lemah; (19) kota padat dan galian berulang</w:t>
+            </w:r>
+          </w:p>
+        </w:tc>
+        <w:tc>
+          <w:tcPr>
+            <w:tcW w:type="dxa" w:w="1750"/>
+            <w:tcMar>
+              <w:top w:type="dxa" w:w="40"/>
+              <w:left w:type="dxa" w:w="90"/>
+              <w:bottom w:type="dxa" w:w="40"/>
+              <w:right w:type="dxa" w:w="90"/>
+            </w:tcMar>
+            <w:vAlign w:val="center"/>
+          </w:tcPr>
+          <w:p>
+            <w:pPr>
+              <w:spacing w:after="40" w:before="40" w:line="240"/>
+              <w:jc w:val="left"/>
+            </w:pPr>
+            <w:r>
+              <w:rPr>
+                <w:rFonts w:ascii="Arial" w:cs="Arial" w:eastAsia="Arial" w:hAnsi="Arial"/>
+                <w:i/>
+                <w:iCs/>
+                <w:sz w:val="22"/>
+                <w:szCs w:val="22"/>
+                <w:lang w:val="id-ID"/>
+              </w:rPr>
+              <w:t xml:space="preserve">Method</w:t>
+            </w:r>
+            <w:r>
+              <w:rPr>
+                <w:rFonts w:ascii="Arial" w:cs="Arial" w:eastAsia="Arial" w:hAnsi="Arial"/>
+                <w:sz w:val="22"/>
+                <w:szCs w:val="22"/>
+                <w:lang w:val="id-ID"/>
+              </w:rPr>
+              <w:t xml:space="preserve">, </w:t>
+            </w:r>
+            <w:r>
+              <w:rPr>
+                <w:rFonts w:ascii="Arial" w:cs="Arial" w:eastAsia="Arial" w:hAnsi="Arial"/>
+                <w:i/>
+                <w:iCs/>
+                <w:sz w:val="22"/>
+                <w:szCs w:val="22"/>
+                <w:lang w:val="id-ID"/>
+              </w:rPr>
+              <w:t xml:space="preserve">Market</w:t>
+            </w:r>
+            <w:r>
+              <w:rPr>
+                <w:rFonts w:ascii="Arial" w:cs="Arial" w:eastAsia="Arial" w:hAnsi="Arial"/>
+                <w:sz w:val="22"/>
+                <w:szCs w:val="22"/>
+                <w:lang w:val="id-ID"/>
+              </w:rPr>
+              <w:t xml:space="preserve"> (3 penyebab)</w:t>
+            </w:r>
+          </w:p>
+        </w:tc>
+      </w:tr>
+      <w:tr>
+        <w:trPr>
+          <w:cantSplit/>
+        </w:trPr>
+        <w:tc>
+          <w:tcPr>
+            <w:tcW w:type="dxa" w:w="7037"/>
+            <w:gridSpan w:val="3"/>
+            <w:tcMar>
+              <w:top w:type="dxa" w:w="40"/>
+              <w:left w:type="dxa" w:w="90"/>
+              <w:bottom w:type="dxa" w:w="40"/>
+              <w:right w:type="dxa" w:w="90"/>
+            </w:tcMar>
+            <w:vAlign w:val="center"/>
+          </w:tcPr>
+          <w:p>
+            <w:pPr>
+              <w:spacing w:after="40" w:before="40" w:line="240"/>
+              <w:jc w:val="right"/>
+            </w:pPr>
+            <w:r>
+              <w:rPr>
+                <w:rFonts w:ascii="Arial" w:cs="Arial" w:eastAsia="Arial" w:hAnsi="Arial"/>
+                <w:b/>
+                <w:bCs/>
+                <w:sz w:val="22"/>
+                <w:szCs w:val="22"/>
+                <w:lang w:val="id-ID"/>
+              </w:rPr>
+              <w:t xml:space="preserve">Jumlah</w:t>
+            </w:r>
+          </w:p>
+        </w:tc>
+        <w:tc>
+          <w:tcPr>
+            <w:tcW w:type="dxa" w:w="1750"/>
+            <w:tcMar>
+              <w:top w:type="dxa" w:w="40"/>
+              <w:left w:type="dxa" w:w="90"/>
+              <w:bottom w:type="dxa" w:w="40"/>
+              <w:right w:type="dxa" w:w="90"/>
+            </w:tcMar>
+            <w:vAlign w:val="center"/>
+          </w:tcPr>
+          <w:p>
+            <w:pPr>
+              <w:spacing w:after="40" w:before="40" w:line="240"/>
+              <w:jc w:val="left"/>
+            </w:pPr>
+            <w:r>
+              <w:rPr>
+                <w:rFonts w:ascii="Arial" w:cs="Arial" w:eastAsia="Arial" w:hAnsi="Arial"/>
+                <w:b/>
+                <w:bCs/>
+                <w:sz w:val="22"/>
+                <w:szCs w:val="22"/>
+                <w:lang w:val="id-ID"/>
+              </w:rPr>
+              <w:t xml:space="preserve">19 penyebab</w:t>
+            </w:r>
+          </w:p>
+        </w:tc>
+      </w:tr>
+    </w:tbl>
+    <w:p>
+      <w:pPr>
+        <w:spacing w:after="120" w:before="160" w:line="360"/>
+        <w:jc w:val="both"/>
+      </w:pPr>
+      <w:r>
+        <w:rPr>
+          <w:rFonts w:ascii="Arial" w:cs="Arial" w:eastAsia="Arial" w:hAnsi="Arial"/>
+          <w:sz w:val="24"/>
+          <w:szCs w:val="24"/>
+          <w:lang w:val="id-ID"/>
+        </w:rPr>
+        <w:t xml:space="preserve">Pengelompokan ini memberi dua catatan. Pertama, kelompok nomor 1 paling luas—tujuh penyebab dari tiga kategori 6M—yang menjadi indikasi awal bahwa kelemahan sistem perencanaan dan pengendalian adalah akar yang paling mendasar. Kedua, kelompok nomor 2 hanya berisi satu penyebab, tetapi tetap berdiri sendiri karena dampaknya langsung menghentikan pekerjaan dan merupakan temuan tersendiri Ombudsman.</w:t>
+      </w:r>
+    </w:p>
+    <w:p>
+      <w:pPr>
+        <w:spacing w:after="120" w:before="0" w:line="360"/>
+        <w:jc w:val="both"/>
+      </w:pPr>
+      <w:r>
+        <w:rPr>
+          <w:rFonts w:ascii="Arial" w:cs="Arial" w:eastAsia="Arial" w:hAnsi="Arial"/>
+          <w:sz w:val="24"/>
+          <w:szCs w:val="24"/>
+          <w:lang w:val="id-ID"/>
+        </w:rPr>
+        <w:t xml:space="preserve">Kelima masalah pokok kemudian dinilai dengan kriteria </w:t>
+      </w:r>
+      <w:r>
+        <w:rPr>
+          <w:rFonts w:ascii="Arial" w:cs="Arial" w:eastAsia="Arial" w:hAnsi="Arial"/>
+          <w:i/>
+          <w:iCs/>
+          <w:sz w:val="24"/>
+          <w:szCs w:val="24"/>
+          <w:lang w:val="id-ID"/>
+        </w:rPr>
+        <w:t xml:space="preserve">Urgency</w:t>
+      </w:r>
+      <w:r>
+        <w:rPr>
+          <w:rFonts w:ascii="Arial" w:cs="Arial" w:eastAsia="Arial" w:hAnsi="Arial"/>
+          <w:sz w:val="24"/>
+          <w:szCs w:val="24"/>
+          <w:lang w:val="id-ID"/>
+        </w:rPr>
+        <w:t xml:space="preserve"> (tingkat kemendesakan), </w:t>
+      </w:r>
+      <w:r>
+        <w:rPr>
+          <w:rFonts w:ascii="Arial" w:cs="Arial" w:eastAsia="Arial" w:hAnsi="Arial"/>
+          <w:i/>
+          <w:iCs/>
+          <w:sz w:val="24"/>
+          <w:szCs w:val="24"/>
+          <w:lang w:val="id-ID"/>
+        </w:rPr>
+        <w:t xml:space="preserve">Seriousness</w:t>
+      </w:r>
+      <w:r>
+        <w:rPr>
+          <w:rFonts w:ascii="Arial" w:cs="Arial" w:eastAsia="Arial" w:hAnsi="Arial"/>
+          <w:sz w:val="24"/>
+          <w:szCs w:val="24"/>
+          <w:lang w:val="id-ID"/>
+        </w:rPr>
+        <w:t xml:space="preserve"> (tingkat keseriusan dampak terhadap masalah utama), dan </w:t>
+      </w:r>
+      <w:r>
+        <w:rPr>
+          <w:rFonts w:ascii="Arial" w:cs="Arial" w:eastAsia="Arial" w:hAnsi="Arial"/>
+          <w:i/>
+          <w:iCs/>
+          <w:sz w:val="24"/>
+          <w:szCs w:val="24"/>
+          <w:lang w:val="id-ID"/>
+        </w:rPr>
+        <w:t xml:space="preserve">Growth</w:t>
+      </w:r>
+      <w:r>
+        <w:rPr>
+          <w:rFonts w:ascii="Arial" w:cs="Arial" w:eastAsia="Arial" w:hAnsi="Arial"/>
+          <w:sz w:val="24"/>
+          <w:szCs w:val="24"/>
+          <w:lang w:val="id-ID"/>
+        </w:rPr>
+        <w:t xml:space="preserve"> (kecenderungan memburuk bila dibiarkan) pada Tabel 4.</w:t>
+      </w:r>
+    </w:p>
+    <w:p>
+      <w:pPr>
+        <w:keepNext/>
+        <w:spacing w:after="80" w:before="120" w:line="276"/>
+        <w:jc w:val="center"/>
+      </w:pPr>
+      <w:r>
+        <w:rPr>
+          <w:rFonts w:ascii="Arial" w:cs="Arial" w:eastAsia="Arial" w:hAnsi="Arial"/>
+          <w:b/>
+          <w:bCs/>
+          <w:sz w:val="22"/>
+          <w:szCs w:val="22"/>
+          <w:lang w:val="id-ID"/>
+        </w:rPr>
+        <w:t xml:space="preserve">Tabel 4. Analisis USG terhadap Masalah Pokok</w:t>
       </w:r>
     </w:p>
     <w:tbl>
@@ -4415,7 +5547,7 @@
                 <w:szCs w:val="22"/>
                 <w:lang w:val="id-ID"/>
               </w:rPr>
-              <w:t xml:space="preserve">Koordinasi pusat–daerah lemah dan panduan teknis SJUT belum tersedia</w:t>
+              <w:t xml:space="preserve">Koordinasi pusat–daerah dan antarpemilik jaringan lemah; panduan teknis SJUT belum tersedia</w:t>
             </w:r>
           </w:p>
         </w:tc>
@@ -4650,264 +5782,6 @@
           <w:lang w:val="id-ID"/>
         </w:rPr>
         <w:t xml:space="preserve">Jika akar masalah tidak segera diatasi, dampak berikut akan terus terjadi dan cenderung membesar:</w:t>
-      </w:r>
-    </w:p>
-    <w:p>
-      <w:pPr>
-        <w:pStyle w:val="ListParagraph"/>
-        <w:numPr>
-          <w:ilvl w:val="0"/>
-          <w:numId w:val="2"/>
-        </w:numPr>
-        <w:spacing w:after="60" w:before="0" w:line="360"/>
-        <w:jc w:val="both"/>
-      </w:pPr>
-      <w:r>
-        <w:rPr>
-          <w:rFonts w:ascii="Arial" w:cs="Arial" w:eastAsia="Arial" w:hAnsi="Arial"/>
-          <w:b/>
-          <w:bCs/>
-          <w:sz w:val="24"/>
-          <w:szCs w:val="24"/>
-          <w:lang w:val="id-ID"/>
-        </w:rPr>
-        <w:t xml:space="preserve">Keselamatan warga terancam</w:t>
-      </w:r>
-      <w:r>
-        <w:rPr>
-          <w:rFonts w:ascii="Arial" w:cs="Arial" w:eastAsia="Arial" w:hAnsi="Arial"/>
-          <w:sz w:val="24"/>
-          <w:szCs w:val="24"/>
-          <w:lang w:val="id-ID"/>
-        </w:rPr>
-        <w:t xml:space="preserve">: kabel menjuntai dan kabel bekas dapat kembali menimbulkan korban jiwa, korsleting, dan kebakaran.</w:t>
-      </w:r>
-    </w:p>
-    <w:p>
-      <w:pPr>
-        <w:pStyle w:val="ListParagraph"/>
-        <w:numPr>
-          <w:ilvl w:val="0"/>
-          <w:numId w:val="2"/>
-        </w:numPr>
-        <w:spacing w:after="60" w:before="0" w:line="360"/>
-        <w:jc w:val="both"/>
-      </w:pPr>
-      <w:r>
-        <w:rPr>
-          <w:rFonts w:ascii="Arial" w:cs="Arial" w:eastAsia="Arial" w:hAnsi="Arial"/>
-          <w:b/>
-          <w:bCs/>
-          <w:sz w:val="24"/>
-          <w:szCs w:val="24"/>
-          <w:lang w:val="id-ID"/>
-        </w:rPr>
-        <w:t xml:space="preserve">Kesemrawutan kabel makin parah</w:t>
-      </w:r>
-      <w:r>
-        <w:rPr>
-          <w:rFonts w:ascii="Arial" w:cs="Arial" w:eastAsia="Arial" w:hAnsi="Arial"/>
-          <w:sz w:val="24"/>
-          <w:szCs w:val="24"/>
-          <w:lang w:val="id-ID"/>
-        </w:rPr>
-        <w:t xml:space="preserve"> seiring pesatnya kebutuhan jaringan digital (serat optik, 5G), sehingga estetika dan citra Jakarta sebagai kota global menurun.</w:t>
-      </w:r>
-    </w:p>
-    <w:p>
-      <w:pPr>
-        <w:pStyle w:val="ListParagraph"/>
-        <w:numPr>
-          <w:ilvl w:val="0"/>
-          <w:numId w:val="2"/>
-        </w:numPr>
-        <w:spacing w:after="60" w:before="0" w:line="360"/>
-        <w:jc w:val="both"/>
-      </w:pPr>
-      <w:r>
-        <w:rPr>
-          <w:rFonts w:ascii="Arial" w:cs="Arial" w:eastAsia="Arial" w:hAnsi="Arial"/>
-          <w:b/>
-          <w:bCs/>
-          <w:sz w:val="24"/>
-          <w:szCs w:val="24"/>
-          <w:lang w:val="id-ID"/>
-        </w:rPr>
-        <w:t xml:space="preserve">Pemborosan dan potensi kerugian daerah</w:t>
-      </w:r>
-      <w:r>
-        <w:rPr>
-          <w:rFonts w:ascii="Arial" w:cs="Arial" w:eastAsia="Arial" w:hAnsi="Arial"/>
-          <w:sz w:val="24"/>
-          <w:szCs w:val="24"/>
-          <w:lang w:val="id-ID"/>
-        </w:rPr>
-        <w:t xml:space="preserve">: </w:t>
-      </w:r>
-      <w:r>
-        <w:rPr>
-          <w:rFonts w:ascii="Arial" w:cs="Arial" w:eastAsia="Arial" w:hAnsi="Arial"/>
-          <w:i/>
-          <w:iCs/>
-          <w:sz w:val="24"/>
-          <w:szCs w:val="24"/>
-          <w:lang w:val="id-ID"/>
-        </w:rPr>
-        <w:t xml:space="preserve">ducting</w:t>
-      </w:r>
-      <w:r>
-        <w:rPr>
-          <w:rFonts w:ascii="Arial" w:cs="Arial" w:eastAsia="Arial" w:hAnsi="Arial"/>
-          <w:sz w:val="24"/>
-          <w:szCs w:val="24"/>
-          <w:lang w:val="id-ID"/>
-        </w:rPr>
-        <w:t xml:space="preserve"> yang sudah terbangun tidak termanfaatkan optimal, sementara galian berulang merusak jalan dan trotoar serta menambah kemacetan.</w:t>
-      </w:r>
-    </w:p>
-    <w:p>
-      <w:pPr>
-        <w:pStyle w:val="ListParagraph"/>
-        <w:numPr>
-          <w:ilvl w:val="0"/>
-          <w:numId w:val="2"/>
-        </w:numPr>
-        <w:spacing w:after="60" w:before="0" w:line="360"/>
-        <w:jc w:val="both"/>
-      </w:pPr>
-      <w:r>
-        <w:rPr>
-          <w:rFonts w:ascii="Arial" w:cs="Arial" w:eastAsia="Arial" w:hAnsi="Arial"/>
-          <w:b/>
-          <w:bCs/>
-          <w:sz w:val="24"/>
-          <w:szCs w:val="24"/>
-          <w:lang w:val="id-ID"/>
-        </w:rPr>
-        <w:t xml:space="preserve">Iklim investasi digital terhambat</w:t>
-      </w:r>
-      <w:r>
-        <w:rPr>
-          <w:rFonts w:ascii="Arial" w:cs="Arial" w:eastAsia="Arial" w:hAnsi="Arial"/>
-          <w:sz w:val="24"/>
-          <w:szCs w:val="24"/>
-          <w:lang w:val="id-ID"/>
-        </w:rPr>
-        <w:t xml:space="preserve"> akibat ketidakpastian hukum, teknis, dan tarif.</w:t>
-      </w:r>
-    </w:p>
-    <w:p>
-      <w:pPr>
-        <w:pStyle w:val="ListParagraph"/>
-        <w:numPr>
-          <w:ilvl w:val="0"/>
-          <w:numId w:val="2"/>
-        </w:numPr>
-        <w:spacing w:after="60" w:before="0" w:line="360"/>
-        <w:jc w:val="both"/>
-      </w:pPr>
-      <w:r>
-        <w:rPr>
-          <w:rFonts w:ascii="Arial" w:cs="Arial" w:eastAsia="Arial" w:hAnsi="Arial"/>
-          <w:b/>
-          <w:bCs/>
-          <w:sz w:val="24"/>
-          <w:szCs w:val="24"/>
-          <w:lang w:val="id-ID"/>
-        </w:rPr>
-        <w:t xml:space="preserve">Kepercayaan publik menurun</w:t>
-      </w:r>
-      <w:r>
-        <w:rPr>
-          <w:rFonts w:ascii="Arial" w:cs="Arial" w:eastAsia="Arial" w:hAnsi="Arial"/>
-          <w:sz w:val="24"/>
-          <w:szCs w:val="24"/>
-          <w:lang w:val="id-ID"/>
-        </w:rPr>
-        <w:t xml:space="preserve"> dan temuan maladministrasi berpotensi berulang.</w:t>
-      </w:r>
-    </w:p>
-    <w:p>
-      <w:pPr>
-        <w:pStyle w:val="Heading1"/>
-      </w:pPr>
-      <w:r>
-        <w:rPr>
-          <w:rFonts w:ascii="Arial" w:cs="Arial" w:eastAsia="Arial" w:hAnsi="Arial"/>
-          <w:sz w:val="24"/>
-          <w:szCs w:val="24"/>
-          <w:lang w:val="id-ID"/>
-        </w:rPr>
-        <w:t xml:space="preserve">B. ALTERNATIF SOLUSI KREATIF DAN SOLUSI PRIORITAS (TAPISAN McNAMARA)</w:t>
-      </w:r>
-    </w:p>
-    <w:p>
-      <w:pPr>
-        <w:pStyle w:val="Heading2"/>
-      </w:pPr>
-      <w:r>
-        <w:rPr>
-          <w:rFonts w:ascii="Arial" w:cs="Arial" w:eastAsia="Arial" w:hAnsi="Arial"/>
-          <w:sz w:val="24"/>
-          <w:szCs w:val="24"/>
-          <w:lang w:val="id-ID"/>
-        </w:rPr>
-        <w:t xml:space="preserve">B.1 Alternatif Solusi Kreatif</w:t>
-      </w:r>
-    </w:p>
-    <w:p>
-      <w:pPr>
-        <w:spacing w:after="120" w:before="0" w:line="360"/>
-        <w:jc w:val="both"/>
-      </w:pPr>
-      <w:r>
-        <w:rPr>
-          <w:rFonts w:ascii="Arial" w:cs="Arial" w:eastAsia="Arial" w:hAnsi="Arial"/>
-          <w:sz w:val="24"/>
-          <w:szCs w:val="24"/>
-          <w:lang w:val="id-ID"/>
-        </w:rPr>
-        <w:t xml:space="preserve">Alternatif solusi dirumuskan untuk menjawab akar masalah dominan dengan teknik berpikir kreatif—curah gagasan (</w:t>
-      </w:r>
-      <w:r>
-        <w:rPr>
-          <w:rFonts w:ascii="Arial" w:cs="Arial" w:eastAsia="Arial" w:hAnsi="Arial"/>
-          <w:i/>
-          <w:iCs/>
-          <w:sz w:val="24"/>
-          <w:szCs w:val="24"/>
-          <w:lang w:val="id-ID"/>
-        </w:rPr>
-        <w:t xml:space="preserve">brainstorming</w:t>
-      </w:r>
-      <w:r>
-        <w:rPr>
-          <w:rFonts w:ascii="Arial" w:cs="Arial" w:eastAsia="Arial" w:hAnsi="Arial"/>
-          <w:sz w:val="24"/>
-          <w:szCs w:val="24"/>
-          <w:lang w:val="id-ID"/>
-        </w:rPr>
-        <w:t xml:space="preserve">), Amati–Tiru–Modifikasi (ATM) praktik baik, dan penggabungan gagasan (</w:t>
-      </w:r>
-      <w:r>
-        <w:rPr>
-          <w:rFonts w:ascii="Arial" w:cs="Arial" w:eastAsia="Arial" w:hAnsi="Arial"/>
-          <w:i/>
-          <w:iCs/>
-          <w:sz w:val="24"/>
-          <w:szCs w:val="24"/>
-          <w:lang w:val="id-ID"/>
-        </w:rPr>
-        <w:t xml:space="preserve">combine</w:t>
-      </w:r>
-      <w:r>
-        <w:rPr>
-          <w:rFonts w:ascii="Arial" w:cs="Arial" w:eastAsia="Arial" w:hAnsi="Arial"/>
-          <w:sz w:val="24"/>
-          <w:szCs w:val="24"/>
-          <w:lang w:val="id-ID"/>
-        </w:rPr>
-        <w:t xml:space="preserve">)—agar tidak berhenti pada solusi rutin. Lima alternatif yang dihasilkan adalah sebagai berikut.</w:t>
       </w:r>
     </w:p>
     <w:p>
@@ -4929,16 +5803,16 @@
           <w:szCs w:val="24"/>
           <w:lang w:val="id-ID"/>
         </w:rPr>
-        <w:t xml:space="preserve">Pergub Payung SJUT dan Rencana Induk SJUT Terintegrasi RTRW–RPJMD</w:t>
-      </w:r>
-      <w:r>
-        <w:rPr>
-          <w:rFonts w:ascii="Arial" w:cs="Arial" w:eastAsia="Arial" w:hAnsi="Arial"/>
-          <w:sz w:val="24"/>
-          <w:szCs w:val="24"/>
-          <w:lang w:val="id-ID"/>
-        </w:rPr>
-        <w:t xml:space="preserve"> (pendekatan regulatif). Menerbitkan regulasi pengganti yang berkesinambungan, disertai rencana induk yang memuat ruas prioritas, tahapan, dan target tahunan, serta disusun melalui konsultasi publik dengan pemangku kepentingan sebagaimana direkomendasikan Ombudsman.</w:t>
+        <w:t xml:space="preserve">Keselamatan warga terancam</w:t>
+      </w:r>
+      <w:r>
+        <w:rPr>
+          <w:rFonts w:ascii="Arial" w:cs="Arial" w:eastAsia="Arial" w:hAnsi="Arial"/>
+          <w:sz w:val="24"/>
+          <w:szCs w:val="24"/>
+          <w:lang w:val="id-ID"/>
+        </w:rPr>
+        <w:t xml:space="preserve">: kabel menjuntai dan kabel bekas dapat kembali menimbulkan korban jiwa, korsleting, dan kebakaran.</w:t>
       </w:r>
     </w:p>
     <w:p>
@@ -4960,60 +5834,16 @@
           <w:szCs w:val="24"/>
           <w:lang w:val="id-ID"/>
         </w:rPr>
-        <w:t xml:space="preserve">Tim Akselerasi SJUT (</w:t>
-      </w:r>
-      <w:r>
-        <w:rPr>
-          <w:rFonts w:ascii="Arial" w:cs="Arial" w:eastAsia="Arial" w:hAnsi="Arial"/>
-          <w:b/>
-          <w:bCs/>
-          <w:i/>
-          <w:iCs/>
-          <w:sz w:val="24"/>
-          <w:szCs w:val="24"/>
-          <w:lang w:val="id-ID"/>
-        </w:rPr>
-        <w:t xml:space="preserve">Project Management Office</w:t>
-      </w:r>
-      <w:r>
-        <w:rPr>
-          <w:rFonts w:ascii="Arial" w:cs="Arial" w:eastAsia="Arial" w:hAnsi="Arial"/>
-          <w:b/>
-          <w:bCs/>
-          <w:sz w:val="24"/>
-          <w:szCs w:val="24"/>
-          <w:lang w:val="id-ID"/>
-        </w:rPr>
-        <w:t xml:space="preserve">) dengan Kontrak Kinerja BUMD</w:t>
-      </w:r>
-      <w:r>
-        <w:rPr>
-          <w:rFonts w:ascii="Arial" w:cs="Arial" w:eastAsia="Arial" w:hAnsi="Arial"/>
-          <w:sz w:val="24"/>
-          <w:szCs w:val="24"/>
-          <w:lang w:val="id-ID"/>
-        </w:rPr>
-        <w:t xml:space="preserve"> (pendekatan kelembagaan). Membentuk satu komando lintas perangkat daerah di bawah Sekretaris Daerah; setiap BUMD terikat indikator kinerja per ruas yang dievaluasi setiap triwulan dengan mekanisme </w:t>
-      </w:r>
-      <w:r>
-        <w:rPr>
-          <w:rFonts w:ascii="Arial" w:cs="Arial" w:eastAsia="Arial" w:hAnsi="Arial"/>
-          <w:i/>
-          <w:iCs/>
-          <w:sz w:val="24"/>
-          <w:szCs w:val="24"/>
-          <w:lang w:val="id-ID"/>
-        </w:rPr>
-        <w:t xml:space="preserve">reward and punishment</w:t>
-      </w:r>
-      <w:r>
-        <w:rPr>
-          <w:rFonts w:ascii="Arial" w:cs="Arial" w:eastAsia="Arial" w:hAnsi="Arial"/>
-          <w:sz w:val="24"/>
-          <w:szCs w:val="24"/>
-          <w:lang w:val="id-ID"/>
-        </w:rPr>
-        <w:t xml:space="preserve">, termasuk pengalihan ruas bila target tidak tercapai.</w:t>
+        <w:t xml:space="preserve">Kesemrawutan kabel makin parah</w:t>
+      </w:r>
+      <w:r>
+        <w:rPr>
+          <w:rFonts w:ascii="Arial" w:cs="Arial" w:eastAsia="Arial" w:hAnsi="Arial"/>
+          <w:sz w:val="24"/>
+          <w:szCs w:val="24"/>
+          <w:lang w:val="id-ID"/>
+        </w:rPr>
+        <w:t xml:space="preserve"> seiring pesatnya kebutuhan jaringan digital (serat optik, 5G), sehingga estetika dan citra Jakarta sebagai kota global menurun.</w:t>
       </w:r>
     </w:p>
     <w:p>
@@ -5035,16 +5865,16 @@
           <w:szCs w:val="24"/>
           <w:lang w:val="id-ID"/>
         </w:rPr>
-        <w:t xml:space="preserve">SIGAP-SJUT: Platform Digital Pengendalian SJUT “Satu Peta, Satu Data, Satu Dasbor”</w:t>
-      </w:r>
-      <w:r>
-        <w:rPr>
-          <w:rFonts w:ascii="Arial" w:cs="Arial" w:eastAsia="Arial" w:hAnsi="Arial"/>
-          <w:sz w:val="24"/>
-          <w:szCs w:val="24"/>
-          <w:lang w:val="id-ID"/>
-        </w:rPr>
-        <w:t xml:space="preserve"> (pendekatan inovasi digital-kolaboratif). Menggabungkan peta digital utilitas di atas dan di bawah tanah (termasuk kabel bekas), dasbor progres dan peringatan dini, transparansi tarif, kanal “Lapor Kabel” terintegrasi JAKI, serta kalender galian terpadu (</w:t>
+        <w:t xml:space="preserve">Pemborosan dan potensi kerugian daerah</w:t>
+      </w:r>
+      <w:r>
+        <w:rPr>
+          <w:rFonts w:ascii="Arial" w:cs="Arial" w:eastAsia="Arial" w:hAnsi="Arial"/>
+          <w:sz w:val="24"/>
+          <w:szCs w:val="24"/>
+          <w:lang w:val="id-ID"/>
+        </w:rPr>
+        <w:t xml:space="preserve">: </w:t>
       </w:r>
       <w:r>
         <w:rPr>
@@ -5055,16 +5885,16 @@
           <w:szCs w:val="24"/>
           <w:lang w:val="id-ID"/>
         </w:rPr>
-        <w:t xml:space="preserve">dig once</w:t>
-      </w:r>
-      <w:r>
-        <w:rPr>
-          <w:rFonts w:ascii="Arial" w:cs="Arial" w:eastAsia="Arial" w:hAnsi="Arial"/>
-          <w:sz w:val="24"/>
-          <w:szCs w:val="24"/>
-          <w:lang w:val="id-ID"/>
-        </w:rPr>
-        <w:t xml:space="preserve">) dalam satu platform yang digunakan bersama oleh Pemprov, BUMD, operator, dan warga.</w:t>
+        <w:t xml:space="preserve">ducting</w:t>
+      </w:r>
+      <w:r>
+        <w:rPr>
+          <w:rFonts w:ascii="Arial" w:cs="Arial" w:eastAsia="Arial" w:hAnsi="Arial"/>
+          <w:sz w:val="24"/>
+          <w:szCs w:val="24"/>
+          <w:lang w:val="id-ID"/>
+        </w:rPr>
+        <w:t xml:space="preserve"> yang sudah terbangun tidak termanfaatkan optimal, sementara galian berulang merusak jalan dan trotoar serta menambah kemacetan.</w:t>
       </w:r>
     </w:p>
     <w:p>
@@ -5086,36 +5916,16 @@
           <w:szCs w:val="24"/>
           <w:lang w:val="id-ID"/>
         </w:rPr>
-        <w:t xml:space="preserve">Skema “Turun Kabel”: Tarif Berbasis Biaya dan Insentif–Disinsentif Migrasi</w:t>
-      </w:r>
-      <w:r>
-        <w:rPr>
-          <w:rFonts w:ascii="Arial" w:cs="Arial" w:eastAsia="Arial" w:hAnsi="Arial"/>
-          <w:sz w:val="24"/>
-          <w:szCs w:val="24"/>
-          <w:lang w:val="id-ID"/>
-        </w:rPr>
-        <w:t xml:space="preserve"> (pendekatan ekonomi). Tarif dihitung dengan formula biaya yang terbuka; operator yang segera bermigrasi dan membongkar kabel bekasnya memperoleh keringanan sewa awal, sedangkan kabel udara di ruas yang telah memiliki SJUT ditertibkan secara bertahap (</w:t>
-      </w:r>
-      <w:r>
-        <w:rPr>
-          <w:rFonts w:ascii="Arial" w:cs="Arial" w:eastAsia="Arial" w:hAnsi="Arial"/>
-          <w:i/>
-          <w:iCs/>
-          <w:sz w:val="24"/>
-          <w:szCs w:val="24"/>
-          <w:lang w:val="id-ID"/>
-        </w:rPr>
-        <w:t xml:space="preserve">sunset policy</w:t>
-      </w:r>
-      <w:r>
-        <w:rPr>
-          <w:rFonts w:ascii="Arial" w:cs="Arial" w:eastAsia="Arial" w:hAnsi="Arial"/>
-          <w:sz w:val="24"/>
-          <w:szCs w:val="24"/>
-          <w:lang w:val="id-ID"/>
-        </w:rPr>
-        <w:t xml:space="preserve">).</w:t>
+        <w:t xml:space="preserve">Iklim investasi digital terhambat</w:t>
+      </w:r>
+      <w:r>
+        <w:rPr>
+          <w:rFonts w:ascii="Arial" w:cs="Arial" w:eastAsia="Arial" w:hAnsi="Arial"/>
+          <w:sz w:val="24"/>
+          <w:szCs w:val="24"/>
+          <w:lang w:val="id-ID"/>
+        </w:rPr>
+        <w:t xml:space="preserve"> akibat ketidakpastian hukum, teknis, dan tarif.</w:t>
       </w:r>
     </w:p>
     <w:p>
@@ -5137,35 +5947,48 @@
           <w:szCs w:val="24"/>
           <w:lang w:val="id-ID"/>
         </w:rPr>
-        <w:t xml:space="preserve">Gerakan “Jakarta Bebas Kabel Mati” Berbasis Ekonomi Sirkular</w:t>
-      </w:r>
-      <w:r>
-        <w:rPr>
-          <w:rFonts w:ascii="Arial" w:cs="Arial" w:eastAsia="Arial" w:hAnsi="Arial"/>
-          <w:sz w:val="24"/>
-          <w:szCs w:val="24"/>
-          <w:lang w:val="id-ID"/>
-        </w:rPr>
-        <w:t xml:space="preserve"> (pendekatan lingkungan dan partisipatif). Pembongkaran kabel bekas secara terjadwal bersama operator, wilayah, dan Satpol PP; material bekas didaur ulang sehingga nilai ekonominya ikut membiayai kegiatan.</w:t>
+        <w:t xml:space="preserve">Kepercayaan publik menurun</w:t>
+      </w:r>
+      <w:r>
+        <w:rPr>
+          <w:rFonts w:ascii="Arial" w:cs="Arial" w:eastAsia="Arial" w:hAnsi="Arial"/>
+          <w:sz w:val="24"/>
+          <w:szCs w:val="24"/>
+          <w:lang w:val="id-ID"/>
+        </w:rPr>
+        <w:t xml:space="preserve"> dan temuan maladministrasi berpotensi berulang.</w:t>
       </w:r>
     </w:p>
     <w:p>
       <w:pPr>
-        <w:pStyle w:val="Heading2"/>
-      </w:pPr>
-      <w:r>
-        <w:rPr>
-          <w:rFonts w:ascii="Arial" w:cs="Arial" w:eastAsia="Arial" w:hAnsi="Arial"/>
-          <w:sz w:val="24"/>
-          <w:szCs w:val="24"/>
-          <w:lang w:val="id-ID"/>
-        </w:rPr>
-        <w:t xml:space="preserve">B.2 Penentuan Solusi Prioritas dengan Tapisan McNamara</w:t>
+        <w:pStyle w:val="Heading1"/>
+      </w:pPr>
+      <w:r>
+        <w:rPr>
+          <w:rFonts w:ascii="Arial" w:cs="Arial" w:eastAsia="Arial" w:hAnsi="Arial"/>
+          <w:sz w:val="24"/>
+          <w:szCs w:val="24"/>
+          <w:lang w:val="id-ID"/>
+        </w:rPr>
+        <w:t xml:space="preserve">B. ALTERNATIF SOLUSI KREATIF DAN SOLUSI PRIORITAS (TAPISAN McNAMARA)</w:t>
       </w:r>
     </w:p>
     <w:p>
       <w:pPr>
-        <w:keepNext/>
+        <w:pStyle w:val="Heading2"/>
+      </w:pPr>
+      <w:r>
+        <w:rPr>
+          <w:rFonts w:ascii="Arial" w:cs="Arial" w:eastAsia="Arial" w:hAnsi="Arial"/>
+          <w:sz w:val="24"/>
+          <w:szCs w:val="24"/>
+          <w:lang w:val="id-ID"/>
+        </w:rPr>
+        <w:t xml:space="preserve">B.1 Alternatif Solusi Kreatif</w:t>
+      </w:r>
+    </w:p>
+    <w:p>
+      <w:pPr>
         <w:spacing w:after="120" w:before="0" w:line="360"/>
         <w:jc w:val="both"/>
       </w:pPr>
@@ -5176,7 +5999,47 @@
           <w:szCs w:val="24"/>
           <w:lang w:val="id-ID"/>
         </w:rPr>
-        <w:t xml:space="preserve">Kelima alternatif dinilai dengan Tapisan McNamara menggunakan tiga kriteria berskala 1–5:</w:t>
+        <w:t xml:space="preserve">Alternatif solusi dirumuskan untuk menjawab akar masalah dominan dengan teknik berpikir kreatif—curah gagasan (</w:t>
+      </w:r>
+      <w:r>
+        <w:rPr>
+          <w:rFonts w:ascii="Arial" w:cs="Arial" w:eastAsia="Arial" w:hAnsi="Arial"/>
+          <w:i/>
+          <w:iCs/>
+          <w:sz w:val="24"/>
+          <w:szCs w:val="24"/>
+          <w:lang w:val="id-ID"/>
+        </w:rPr>
+        <w:t xml:space="preserve">brainstorming</w:t>
+      </w:r>
+      <w:r>
+        <w:rPr>
+          <w:rFonts w:ascii="Arial" w:cs="Arial" w:eastAsia="Arial" w:hAnsi="Arial"/>
+          <w:sz w:val="24"/>
+          <w:szCs w:val="24"/>
+          <w:lang w:val="id-ID"/>
+        </w:rPr>
+        <w:t xml:space="preserve">), Amati–Tiru–Modifikasi (ATM) praktik baik, dan penggabungan gagasan (</w:t>
+      </w:r>
+      <w:r>
+        <w:rPr>
+          <w:rFonts w:ascii="Arial" w:cs="Arial" w:eastAsia="Arial" w:hAnsi="Arial"/>
+          <w:i/>
+          <w:iCs/>
+          <w:sz w:val="24"/>
+          <w:szCs w:val="24"/>
+          <w:lang w:val="id-ID"/>
+        </w:rPr>
+        <w:t xml:space="preserve">combine</w:t>
+      </w:r>
+      <w:r>
+        <w:rPr>
+          <w:rFonts w:ascii="Arial" w:cs="Arial" w:eastAsia="Arial" w:hAnsi="Arial"/>
+          <w:sz w:val="24"/>
+          <w:szCs w:val="24"/>
+          <w:lang w:val="id-ID"/>
+        </w:rPr>
+        <w:t xml:space="preserve">)—agar tidak berhenti pada solusi rutin. Lima alternatif yang dihasilkan adalah sebagai berikut.</w:t>
       </w:r>
     </w:p>
     <w:p>
@@ -5198,16 +6061,16 @@
           <w:szCs w:val="24"/>
           <w:lang w:val="id-ID"/>
         </w:rPr>
-        <w:t xml:space="preserve">Kontribusi</w:t>
-      </w:r>
-      <w:r>
-        <w:rPr>
-          <w:rFonts w:ascii="Arial" w:cs="Arial" w:eastAsia="Arial" w:hAnsi="Arial"/>
-          <w:sz w:val="24"/>
-          <w:szCs w:val="24"/>
-          <w:lang w:val="id-ID"/>
-        </w:rPr>
-        <w:t xml:space="preserve">: besarnya sumbangan alternatif dalam menyelesaikan akar masalah dominan dan meningkatkan realisasi SJUT.</w:t>
+        <w:t xml:space="preserve">Pergub Payung SJUT dan Rencana Induk SJUT Terintegrasi RTRW–RPJMD</w:t>
+      </w:r>
+      <w:r>
+        <w:rPr>
+          <w:rFonts w:ascii="Arial" w:cs="Arial" w:eastAsia="Arial" w:hAnsi="Arial"/>
+          <w:sz w:val="24"/>
+          <w:szCs w:val="24"/>
+          <w:lang w:val="id-ID"/>
+        </w:rPr>
+        <w:t xml:space="preserve"> (pendekatan regulatif). Menerbitkan regulasi pengganti yang berkesinambungan, disertai rencana induk yang memuat ruas prioritas, tahapan, dan target tahunan, serta disusun melalui konsultasi publik dengan pemangku kepentingan sebagaimana direkomendasikan Ombudsman.</w:t>
       </w:r>
     </w:p>
     <w:p>
@@ -5229,16 +6092,60 @@
           <w:szCs w:val="24"/>
           <w:lang w:val="id-ID"/>
         </w:rPr>
-        <w:t xml:space="preserve">Kelayakan</w:t>
-      </w:r>
-      <w:r>
-        <w:rPr>
-          <w:rFonts w:ascii="Arial" w:cs="Arial" w:eastAsia="Arial" w:hAnsi="Arial"/>
-          <w:sz w:val="24"/>
-          <w:szCs w:val="24"/>
-          <w:lang w:val="id-ID"/>
-        </w:rPr>
-        <w:t xml:space="preserve">: kemudahan pelaksanaan dilihat dari kewenangan, regulasi, SDM, teknologi, waktu, dan dukungan pemangku kepentingan.</w:t>
+        <w:t xml:space="preserve">Tim Akselerasi SJUT (</w:t>
+      </w:r>
+      <w:r>
+        <w:rPr>
+          <w:rFonts w:ascii="Arial" w:cs="Arial" w:eastAsia="Arial" w:hAnsi="Arial"/>
+          <w:b/>
+          <w:bCs/>
+          <w:i/>
+          <w:iCs/>
+          <w:sz w:val="24"/>
+          <w:szCs w:val="24"/>
+          <w:lang w:val="id-ID"/>
+        </w:rPr>
+        <w:t xml:space="preserve">Project Management Office</w:t>
+      </w:r>
+      <w:r>
+        <w:rPr>
+          <w:rFonts w:ascii="Arial" w:cs="Arial" w:eastAsia="Arial" w:hAnsi="Arial"/>
+          <w:b/>
+          <w:bCs/>
+          <w:sz w:val="24"/>
+          <w:szCs w:val="24"/>
+          <w:lang w:val="id-ID"/>
+        </w:rPr>
+        <w:t xml:space="preserve">) dengan Kontrak Kinerja BUMD</w:t>
+      </w:r>
+      <w:r>
+        <w:rPr>
+          <w:rFonts w:ascii="Arial" w:cs="Arial" w:eastAsia="Arial" w:hAnsi="Arial"/>
+          <w:sz w:val="24"/>
+          <w:szCs w:val="24"/>
+          <w:lang w:val="id-ID"/>
+        </w:rPr>
+        <w:t xml:space="preserve"> (pendekatan kelembagaan). Membentuk satu komando lintas perangkat daerah di bawah Sekretaris Daerah; setiap BUMD terikat indikator kinerja per ruas yang dievaluasi setiap triwulan dengan mekanisme </w:t>
+      </w:r>
+      <w:r>
+        <w:rPr>
+          <w:rFonts w:ascii="Arial" w:cs="Arial" w:eastAsia="Arial" w:hAnsi="Arial"/>
+          <w:i/>
+          <w:iCs/>
+          <w:sz w:val="24"/>
+          <w:szCs w:val="24"/>
+          <w:lang w:val="id-ID"/>
+        </w:rPr>
+        <w:t xml:space="preserve">reward and punishment</w:t>
+      </w:r>
+      <w:r>
+        <w:rPr>
+          <w:rFonts w:ascii="Arial" w:cs="Arial" w:eastAsia="Arial" w:hAnsi="Arial"/>
+          <w:sz w:val="24"/>
+          <w:szCs w:val="24"/>
+          <w:lang w:val="id-ID"/>
+        </w:rPr>
+        <w:t xml:space="preserve">, termasuk pengalihan ruas bila target tidak tercapai.</w:t>
       </w:r>
     </w:p>
     <w:p>
@@ -5260,6 +6167,231 @@
           <w:szCs w:val="24"/>
           <w:lang w:val="id-ID"/>
         </w:rPr>
+        <w:t xml:space="preserve">SIGAP-SJUT: Platform Digital Pengendalian SJUT “Satu Peta, Satu Data, Satu Dasbor”</w:t>
+      </w:r>
+      <w:r>
+        <w:rPr>
+          <w:rFonts w:ascii="Arial" w:cs="Arial" w:eastAsia="Arial" w:hAnsi="Arial"/>
+          <w:sz w:val="24"/>
+          <w:szCs w:val="24"/>
+          <w:lang w:val="id-ID"/>
+        </w:rPr>
+        <w:t xml:space="preserve"> (pendekatan inovasi digital-kolaboratif). Menggabungkan peta digital utilitas di atas dan di bawah tanah (termasuk kabel bekas), dasbor progres dan peringatan dini, transparansi tarif, kanal “Lapor Kabel” terintegrasi JAKI, serta kalender galian terpadu (</w:t>
+      </w:r>
+      <w:r>
+        <w:rPr>
+          <w:rFonts w:ascii="Arial" w:cs="Arial" w:eastAsia="Arial" w:hAnsi="Arial"/>
+          <w:i/>
+          <w:iCs/>
+          <w:sz w:val="24"/>
+          <w:szCs w:val="24"/>
+          <w:lang w:val="id-ID"/>
+        </w:rPr>
+        <w:t xml:space="preserve">dig once</w:t>
+      </w:r>
+      <w:r>
+        <w:rPr>
+          <w:rFonts w:ascii="Arial" w:cs="Arial" w:eastAsia="Arial" w:hAnsi="Arial"/>
+          <w:sz w:val="24"/>
+          <w:szCs w:val="24"/>
+          <w:lang w:val="id-ID"/>
+        </w:rPr>
+        <w:t xml:space="preserve">) dalam satu platform yang digunakan bersama oleh Pemprov, BUMD, operator, dan warga.</w:t>
+      </w:r>
+    </w:p>
+    <w:p>
+      <w:pPr>
+        <w:pStyle w:val="ListParagraph"/>
+        <w:numPr>
+          <w:ilvl w:val="0"/>
+          <w:numId w:val="4"/>
+        </w:numPr>
+        <w:spacing w:after="60" w:before="0" w:line="360"/>
+        <w:jc w:val="both"/>
+      </w:pPr>
+      <w:r>
+        <w:rPr>
+          <w:rFonts w:ascii="Arial" w:cs="Arial" w:eastAsia="Arial" w:hAnsi="Arial"/>
+          <w:b/>
+          <w:bCs/>
+          <w:sz w:val="24"/>
+          <w:szCs w:val="24"/>
+          <w:lang w:val="id-ID"/>
+        </w:rPr>
+        <w:t xml:space="preserve">Skema “Turun Kabel”: Tarif Berbasis Biaya dan Insentif–Disinsentif Migrasi</w:t>
+      </w:r>
+      <w:r>
+        <w:rPr>
+          <w:rFonts w:ascii="Arial" w:cs="Arial" w:eastAsia="Arial" w:hAnsi="Arial"/>
+          <w:sz w:val="24"/>
+          <w:szCs w:val="24"/>
+          <w:lang w:val="id-ID"/>
+        </w:rPr>
+        <w:t xml:space="preserve"> (pendekatan ekonomi). Tarif dihitung dengan formula biaya yang terbuka; operator yang segera bermigrasi dan membongkar kabel bekasnya memperoleh keringanan sewa awal, sedangkan kabel udara di ruas yang telah memiliki SJUT ditertibkan secara bertahap (</w:t>
+      </w:r>
+      <w:r>
+        <w:rPr>
+          <w:rFonts w:ascii="Arial" w:cs="Arial" w:eastAsia="Arial" w:hAnsi="Arial"/>
+          <w:i/>
+          <w:iCs/>
+          <w:sz w:val="24"/>
+          <w:szCs w:val="24"/>
+          <w:lang w:val="id-ID"/>
+        </w:rPr>
+        <w:t xml:space="preserve">sunset policy</w:t>
+      </w:r>
+      <w:r>
+        <w:rPr>
+          <w:rFonts w:ascii="Arial" w:cs="Arial" w:eastAsia="Arial" w:hAnsi="Arial"/>
+          <w:sz w:val="24"/>
+          <w:szCs w:val="24"/>
+          <w:lang w:val="id-ID"/>
+        </w:rPr>
+        <w:t xml:space="preserve">).</w:t>
+      </w:r>
+    </w:p>
+    <w:p>
+      <w:pPr>
+        <w:pStyle w:val="ListParagraph"/>
+        <w:numPr>
+          <w:ilvl w:val="0"/>
+          <w:numId w:val="4"/>
+        </w:numPr>
+        <w:spacing w:after="60" w:before="0" w:line="360"/>
+        <w:jc w:val="both"/>
+      </w:pPr>
+      <w:r>
+        <w:rPr>
+          <w:rFonts w:ascii="Arial" w:cs="Arial" w:eastAsia="Arial" w:hAnsi="Arial"/>
+          <w:b/>
+          <w:bCs/>
+          <w:sz w:val="24"/>
+          <w:szCs w:val="24"/>
+          <w:lang w:val="id-ID"/>
+        </w:rPr>
+        <w:t xml:space="preserve">Gerakan “Jakarta Bebas Kabel Mati” Berbasis Ekonomi Sirkular</w:t>
+      </w:r>
+      <w:r>
+        <w:rPr>
+          <w:rFonts w:ascii="Arial" w:cs="Arial" w:eastAsia="Arial" w:hAnsi="Arial"/>
+          <w:sz w:val="24"/>
+          <w:szCs w:val="24"/>
+          <w:lang w:val="id-ID"/>
+        </w:rPr>
+        <w:t xml:space="preserve"> (pendekatan lingkungan dan partisipatif). Pembongkaran kabel bekas secara terjadwal bersama operator, wilayah, dan Satpol PP; material bekas didaur ulang sehingga nilai ekonominya ikut membiayai kegiatan.</w:t>
+      </w:r>
+    </w:p>
+    <w:p>
+      <w:pPr>
+        <w:pStyle w:val="Heading2"/>
+      </w:pPr>
+      <w:r>
+        <w:rPr>
+          <w:rFonts w:ascii="Arial" w:cs="Arial" w:eastAsia="Arial" w:hAnsi="Arial"/>
+          <w:sz w:val="24"/>
+          <w:szCs w:val="24"/>
+          <w:lang w:val="id-ID"/>
+        </w:rPr>
+        <w:t xml:space="preserve">B.2 Penentuan Solusi Prioritas dengan Tapisan McNamara</w:t>
+      </w:r>
+    </w:p>
+    <w:p>
+      <w:pPr>
+        <w:keepNext/>
+        <w:spacing w:after="120" w:before="0" w:line="360"/>
+        <w:jc w:val="both"/>
+      </w:pPr>
+      <w:r>
+        <w:rPr>
+          <w:rFonts w:ascii="Arial" w:cs="Arial" w:eastAsia="Arial" w:hAnsi="Arial"/>
+          <w:sz w:val="24"/>
+          <w:szCs w:val="24"/>
+          <w:lang w:val="id-ID"/>
+        </w:rPr>
+        <w:t xml:space="preserve">Kelima alternatif dinilai dengan Tapisan McNamara menggunakan tiga kriteria berskala 1–5:</w:t>
+      </w:r>
+    </w:p>
+    <w:p>
+      <w:pPr>
+        <w:pStyle w:val="ListParagraph"/>
+        <w:numPr>
+          <w:ilvl w:val="0"/>
+          <w:numId w:val="5"/>
+        </w:numPr>
+        <w:spacing w:after="60" w:before="0" w:line="360"/>
+        <w:jc w:val="both"/>
+      </w:pPr>
+      <w:r>
+        <w:rPr>
+          <w:rFonts w:ascii="Arial" w:cs="Arial" w:eastAsia="Arial" w:hAnsi="Arial"/>
+          <w:b/>
+          <w:bCs/>
+          <w:sz w:val="24"/>
+          <w:szCs w:val="24"/>
+          <w:lang w:val="id-ID"/>
+        </w:rPr>
+        <w:t xml:space="preserve">Kontribusi</w:t>
+      </w:r>
+      <w:r>
+        <w:rPr>
+          <w:rFonts w:ascii="Arial" w:cs="Arial" w:eastAsia="Arial" w:hAnsi="Arial"/>
+          <w:sz w:val="24"/>
+          <w:szCs w:val="24"/>
+          <w:lang w:val="id-ID"/>
+        </w:rPr>
+        <w:t xml:space="preserve">: besarnya sumbangan alternatif dalam menyelesaikan akar masalah dominan dan meningkatkan realisasi SJUT.</w:t>
+      </w:r>
+    </w:p>
+    <w:p>
+      <w:pPr>
+        <w:pStyle w:val="ListParagraph"/>
+        <w:numPr>
+          <w:ilvl w:val="0"/>
+          <w:numId w:val="5"/>
+        </w:numPr>
+        <w:spacing w:after="60" w:before="0" w:line="360"/>
+        <w:jc w:val="both"/>
+      </w:pPr>
+      <w:r>
+        <w:rPr>
+          <w:rFonts w:ascii="Arial" w:cs="Arial" w:eastAsia="Arial" w:hAnsi="Arial"/>
+          <w:b/>
+          <w:bCs/>
+          <w:sz w:val="24"/>
+          <w:szCs w:val="24"/>
+          <w:lang w:val="id-ID"/>
+        </w:rPr>
+        <w:t xml:space="preserve">Kelayakan</w:t>
+      </w:r>
+      <w:r>
+        <w:rPr>
+          <w:rFonts w:ascii="Arial" w:cs="Arial" w:eastAsia="Arial" w:hAnsi="Arial"/>
+          <w:sz w:val="24"/>
+          <w:szCs w:val="24"/>
+          <w:lang w:val="id-ID"/>
+        </w:rPr>
+        <w:t xml:space="preserve">: kemudahan pelaksanaan dilihat dari kewenangan, regulasi, SDM, teknologi, waktu, dan dukungan pemangku kepentingan.</w:t>
+      </w:r>
+    </w:p>
+    <w:p>
+      <w:pPr>
+        <w:pStyle w:val="ListParagraph"/>
+        <w:numPr>
+          <w:ilvl w:val="0"/>
+          <w:numId w:val="5"/>
+        </w:numPr>
+        <w:spacing w:after="60" w:before="0" w:line="360"/>
+        <w:jc w:val="both"/>
+      </w:pPr>
+      <w:r>
+        <w:rPr>
+          <w:rFonts w:ascii="Arial" w:cs="Arial" w:eastAsia="Arial" w:hAnsi="Arial"/>
+          <w:b/>
+          <w:bCs/>
+          <w:sz w:val="24"/>
+          <w:szCs w:val="24"/>
+          <w:lang w:val="id-ID"/>
+        </w:rPr>
         <w:t xml:space="preserve">Biaya</w:t>
       </w:r>
       <w:r>
@@ -5287,7 +6419,7 @@
           <w:szCs w:val="22"/>
           <w:lang w:val="id-ID"/>
         </w:rPr>
-        <w:t xml:space="preserve">Tabel 4. Tapisan McNamara terhadap Alternatif Solusi</w:t>
+        <w:t xml:space="preserve">Tabel 5. Tapisan McNamara terhadap Alternatif Solusi</w:t>
       </w:r>
     </w:p>
     <w:tbl>
@@ -6555,7 +7687,7 @@
         <w:pStyle w:val="ListParagraph"/>
         <w:numPr>
           <w:ilvl w:val="0"/>
-          <w:numId w:val="4"/>
+          <w:numId w:val="5"/>
         </w:numPr>
         <w:spacing w:after="60" w:before="0" w:line="360"/>
         <w:jc w:val="both"/>
@@ -6586,7 +7718,7 @@
         <w:pStyle w:val="ListParagraph"/>
         <w:numPr>
           <w:ilvl w:val="0"/>
-          <w:numId w:val="4"/>
+          <w:numId w:val="5"/>
         </w:numPr>
         <w:spacing w:after="60" w:before="0" w:line="360"/>
         <w:jc w:val="both"/>
@@ -6617,7 +7749,7 @@
         <w:pStyle w:val="ListParagraph"/>
         <w:numPr>
           <w:ilvl w:val="0"/>
-          <w:numId w:val="4"/>
+          <w:numId w:val="5"/>
         </w:numPr>
         <w:spacing w:after="60" w:before="0" w:line="360"/>
         <w:jc w:val="both"/>
@@ -6648,7 +7780,7 @@
         <w:pStyle w:val="ListParagraph"/>
         <w:numPr>
           <w:ilvl w:val="0"/>
-          <w:numId w:val="4"/>
+          <w:numId w:val="5"/>
         </w:numPr>
         <w:spacing w:after="60" w:before="0" w:line="360"/>
         <w:jc w:val="both"/>
@@ -6679,7 +7811,7 @@
         <w:pStyle w:val="ListParagraph"/>
         <w:numPr>
           <w:ilvl w:val="0"/>
-          <w:numId w:val="4"/>
+          <w:numId w:val="5"/>
         </w:numPr>
         <w:spacing w:after="60" w:before="0" w:line="360"/>
         <w:jc w:val="both"/>
@@ -6826,7 +7958,7 @@
           <w:szCs w:val="24"/>
           <w:lang w:val="id-ID"/>
         </w:rPr>
-        <w:t xml:space="preserve"> adalah platform digital kolaboratif untuk merencanakan, memantau, dan mengendalikan pembangunan SJUT dengan prinsip “Satu Peta, Satu Data, Satu Dasbor”. Nama SIGAP menegaskan perubahan budaya kerja: dari menunggu aduan dan korban menjadi sigap mendeteksi dan mencegah. Platform ini terdiri atas lima modul (Tabel 5).</w:t>
+        <w:t xml:space="preserve"> adalah platform digital kolaboratif untuk merencanakan, memantau, dan mengendalikan pembangunan SJUT dengan prinsip “Satu Peta, Satu Data, Satu Dasbor”. Nama SIGAP menegaskan perubahan budaya kerja: dari menunggu aduan dan korban menjadi sigap mendeteksi dan mencegah. Platform ini terdiri atas lima modul (Tabel 6).</w:t>
       </w:r>
     </w:p>
     <w:p>
@@ -6844,7 +7976,7 @@
           <w:szCs w:val="22"/>
           <w:lang w:val="id-ID"/>
         </w:rPr>
-        <w:t xml:space="preserve">Tabel 5. Modul SIGAP-SJUT dan Akar Masalah yang Dijawab</w:t>
+        <w:t xml:space="preserve">Tabel 6. Modul SIGAP-SJUT dan Akar Masalah yang Dijawab</w:t>
       </w:r>
     </w:p>
     <w:tbl>
@@ -7761,7 +8893,7 @@
           <w:szCs w:val="24"/>
           <w:lang w:val="id-ID"/>
         </w:rPr>
-        <w:t xml:space="preserve">SIGAP-SJUT memberi nilai tambah nyata bagi setiap pemangku kepentingan (Tabel 6).</w:t>
+        <w:t xml:space="preserve">SIGAP-SJUT memberi nilai tambah nyata bagi setiap pemangku kepentingan (Tabel 7).</w:t>
       </w:r>
     </w:p>
     <w:p>
@@ -7779,7 +8911,7 @@
           <w:szCs w:val="22"/>
           <w:lang w:val="id-ID"/>
         </w:rPr>
-        <w:t xml:space="preserve">Tabel 6. Nilai Tambah SIGAP-SJUT bagi Pemangku Kepentingan</w:t>
+        <w:t xml:space="preserve">Tabel 7. Nilai Tambah SIGAP-SJUT bagi Pemangku Kepentingan</w:t>
       </w:r>
     </w:p>
     <w:tbl>
@@ -8255,7 +9387,7 @@
         <w:pStyle w:val="ListParagraph"/>
         <w:numPr>
           <w:ilvl w:val="0"/>
-          <w:numId w:val="5"/>
+          <w:numId w:val="6"/>
         </w:numPr>
         <w:spacing w:after="60" w:before="0" w:line="360"/>
         <w:jc w:val="both"/>
@@ -8279,6 +9411,133 @@
           <w:lang w:val="id-ID"/>
         </w:rPr>
         <w:t xml:space="preserve">: dapat diterapkan di kota besar lain yang menghadapi kesemrawutan kabel udara.</w:t>
+      </w:r>
+    </w:p>
+    <w:p>
+      <w:pPr>
+        <w:pStyle w:val="ListParagraph"/>
+        <w:numPr>
+          <w:ilvl w:val="0"/>
+          <w:numId w:val="6"/>
+        </w:numPr>
+        <w:spacing w:after="60" w:before="0" w:line="360"/>
+        <w:jc w:val="both"/>
+      </w:pPr>
+      <w:r>
+        <w:rPr>
+          <w:rFonts w:ascii="Arial" w:cs="Arial" w:eastAsia="Arial" w:hAnsi="Arial"/>
+          <w:b/>
+          <w:bCs/>
+          <w:sz w:val="24"/>
+          <w:szCs w:val="24"/>
+          <w:lang w:val="id-ID"/>
+        </w:rPr>
+        <w:t xml:space="preserve">Antarsektor</w:t>
+      </w:r>
+      <w:r>
+        <w:rPr>
+          <w:rFonts w:ascii="Arial" w:cs="Arial" w:eastAsia="Arial" w:hAnsi="Arial"/>
+          <w:sz w:val="24"/>
+          <w:szCs w:val="24"/>
+          <w:lang w:val="id-ID"/>
+        </w:rPr>
+        <w:t xml:space="preserve">: modul yang sama dapat dipakai untuk jaringan air minum, listrik, gas, dan drainase.</w:t>
+      </w:r>
+    </w:p>
+    <w:p>
+      <w:pPr>
+        <w:pStyle w:val="ListParagraph"/>
+        <w:numPr>
+          <w:ilvl w:val="0"/>
+          <w:numId w:val="6"/>
+        </w:numPr>
+        <w:spacing w:after="60" w:before="0" w:line="360"/>
+        <w:jc w:val="both"/>
+      </w:pPr>
+      <w:r>
+        <w:rPr>
+          <w:rFonts w:ascii="Arial" w:cs="Arial" w:eastAsia="Arial" w:hAnsi="Arial"/>
+          <w:b/>
+          <w:bCs/>
+          <w:sz w:val="24"/>
+          <w:szCs w:val="24"/>
+          <w:lang w:val="id-ID"/>
+        </w:rPr>
+        <w:t xml:space="preserve">Antarjenjang</w:t>
+      </w:r>
+      <w:r>
+        <w:rPr>
+          <w:rFonts w:ascii="Arial" w:cs="Arial" w:eastAsia="Arial" w:hAnsi="Arial"/>
+          <w:sz w:val="24"/>
+          <w:szCs w:val="24"/>
+          <w:lang w:val="id-ID"/>
+        </w:rPr>
+        <w:t xml:space="preserve">: menjadi model rujukan bagi Komdigi dalam menyusun panduan teknis SJUT nasional.</w:t>
+      </w:r>
+    </w:p>
+    <w:p>
+      <w:pPr>
+        <w:spacing w:after="120" w:before="60" w:line="360"/>
+        <w:jc w:val="both"/>
+      </w:pPr>
+      <w:r>
+        <w:rPr>
+          <w:rFonts w:ascii="Arial" w:cs="Arial" w:eastAsia="Arial" w:hAnsi="Arial"/>
+          <w:sz w:val="24"/>
+          <w:szCs w:val="24"/>
+          <w:lang w:val="id-ID"/>
+        </w:rPr>
+        <w:t xml:space="preserve">Replikasi dipermudah dengan paket replikasi berisi SOP, kamus data, modul pelatihan, dan kode sumber milik pemerintah, serta dapat disebarluaskan melalui forum inovasi pelayanan publik seperti Kompetisi Inovasi Pelayanan Publik (KIPP) KemenPAN-RB.</w:t>
+      </w:r>
+    </w:p>
+    <w:p>
+      <w:pPr>
+        <w:pStyle w:val="Heading3"/>
+      </w:pPr>
+      <w:r>
+        <w:rPr>
+          <w:rFonts w:ascii="Arial" w:cs="Arial" w:eastAsia="Arial" w:hAnsi="Arial"/>
+          <w:sz w:val="24"/>
+          <w:szCs w:val="24"/>
+          <w:lang w:val="id-ID"/>
+        </w:rPr>
+        <w:t xml:space="preserve">4) </w:t>
+      </w:r>
+      <w:r>
+        <w:rPr>
+          <w:rFonts w:ascii="Arial" w:cs="Arial" w:eastAsia="Arial" w:hAnsi="Arial"/>
+          <w:i/>
+          <w:iCs/>
+          <w:sz w:val="24"/>
+          <w:szCs w:val="24"/>
+          <w:lang w:val="id-ID"/>
+        </w:rPr>
+        <w:t xml:space="preserve">Sustainability</w:t>
+      </w:r>
+      <w:r>
+        <w:rPr>
+          <w:rFonts w:ascii="Arial" w:cs="Arial" w:eastAsia="Arial" w:hAnsi="Arial"/>
+          <w:sz w:val="24"/>
+          <w:szCs w:val="24"/>
+          <w:lang w:val="id-ID"/>
+        </w:rPr>
+        <w:t xml:space="preserve"> (Berkelanjutan)</w:t>
+      </w:r>
+    </w:p>
+    <w:p>
+      <w:pPr>
+        <w:keepNext/>
+        <w:spacing w:after="60" w:before="0" w:line="360"/>
+        <w:jc w:val="both"/>
+      </w:pPr>
+      <w:r>
+        <w:rPr>
+          <w:rFonts w:ascii="Arial" w:cs="Arial" w:eastAsia="Arial" w:hAnsi="Arial"/>
+          <w:sz w:val="24"/>
+          <w:szCs w:val="24"/>
+          <w:lang w:val="id-ID"/>
+        </w:rPr>
+        <w:t xml:space="preserve">Keberlanjutan SIGAP-SJUT ditopang oleh enam pilar:</w:t>
       </w:r>
     </w:p>
     <w:p>
@@ -8300,16 +9559,16 @@
           <w:szCs w:val="24"/>
           <w:lang w:val="id-ID"/>
         </w:rPr>
-        <w:t xml:space="preserve">Antarsektor</w:t>
-      </w:r>
-      <w:r>
-        <w:rPr>
-          <w:rFonts w:ascii="Arial" w:cs="Arial" w:eastAsia="Arial" w:hAnsi="Arial"/>
-          <w:sz w:val="24"/>
-          <w:szCs w:val="24"/>
-          <w:lang w:val="id-ID"/>
-        </w:rPr>
-        <w:t xml:space="preserve">: modul yang sama dapat dipakai untuk jaringan air minum, listrik, gas, dan drainase.</w:t>
+        <w:t xml:space="preserve">Regulasi</w:t>
+      </w:r>
+      <w:r>
+        <w:rPr>
+          <w:rFonts w:ascii="Arial" w:cs="Arial" w:eastAsia="Arial" w:hAnsi="Arial"/>
+          <w:sz w:val="24"/>
+          <w:szCs w:val="24"/>
+          <w:lang w:val="id-ID"/>
+        </w:rPr>
+        <w:t xml:space="preserve">: penggunaan SIGAP-SJUT diwajibkan dalam Pergub SJUT dan rencana induk yang terintegrasi dengan RPJMD dan RTRW, sehingga tidak bergantung pada pejabat tertentu.</w:t>
       </w:r>
     </w:p>
     <w:p>
@@ -8331,81 +9590,16 @@
           <w:szCs w:val="24"/>
           <w:lang w:val="id-ID"/>
         </w:rPr>
-        <w:t xml:space="preserve">Antarjenjang</w:t>
-      </w:r>
-      <w:r>
-        <w:rPr>
-          <w:rFonts w:ascii="Arial" w:cs="Arial" w:eastAsia="Arial" w:hAnsi="Arial"/>
-          <w:sz w:val="24"/>
-          <w:szCs w:val="24"/>
-          <w:lang w:val="id-ID"/>
-        </w:rPr>
-        <w:t xml:space="preserve">: menjadi model rujukan bagi Komdigi dalam menyusun panduan teknis SJUT nasional.</w:t>
-      </w:r>
-    </w:p>
-    <w:p>
-      <w:pPr>
-        <w:spacing w:after="120" w:before="60" w:line="360"/>
-        <w:jc w:val="both"/>
-      </w:pPr>
-      <w:r>
-        <w:rPr>
-          <w:rFonts w:ascii="Arial" w:cs="Arial" w:eastAsia="Arial" w:hAnsi="Arial"/>
-          <w:sz w:val="24"/>
-          <w:szCs w:val="24"/>
-          <w:lang w:val="id-ID"/>
-        </w:rPr>
-        <w:t xml:space="preserve">Replikasi dipermudah dengan paket replikasi berisi SOP, kamus data, modul pelatihan, dan kode sumber milik pemerintah, serta dapat disebarluaskan melalui forum inovasi pelayanan publik seperti Kompetisi Inovasi Pelayanan Publik (KIPP) KemenPAN-RB.</w:t>
-      </w:r>
-    </w:p>
-    <w:p>
-      <w:pPr>
-        <w:pStyle w:val="Heading3"/>
-      </w:pPr>
-      <w:r>
-        <w:rPr>
-          <w:rFonts w:ascii="Arial" w:cs="Arial" w:eastAsia="Arial" w:hAnsi="Arial"/>
-          <w:sz w:val="24"/>
-          <w:szCs w:val="24"/>
-          <w:lang w:val="id-ID"/>
-        </w:rPr>
-        <w:t xml:space="preserve">4) </w:t>
-      </w:r>
-      <w:r>
-        <w:rPr>
-          <w:rFonts w:ascii="Arial" w:cs="Arial" w:eastAsia="Arial" w:hAnsi="Arial"/>
-          <w:i/>
-          <w:iCs/>
-          <w:sz w:val="24"/>
-          <w:szCs w:val="24"/>
-          <w:lang w:val="id-ID"/>
-        </w:rPr>
-        <w:t xml:space="preserve">Sustainability</w:t>
-      </w:r>
-      <w:r>
-        <w:rPr>
-          <w:rFonts w:ascii="Arial" w:cs="Arial" w:eastAsia="Arial" w:hAnsi="Arial"/>
-          <w:sz w:val="24"/>
-          <w:szCs w:val="24"/>
-          <w:lang w:val="id-ID"/>
-        </w:rPr>
-        <w:t xml:space="preserve"> (Berkelanjutan)</w:t>
-      </w:r>
-    </w:p>
-    <w:p>
-      <w:pPr>
-        <w:keepNext/>
-        <w:spacing w:after="60" w:before="0" w:line="360"/>
-        <w:jc w:val="both"/>
-      </w:pPr>
-      <w:r>
-        <w:rPr>
-          <w:rFonts w:ascii="Arial" w:cs="Arial" w:eastAsia="Arial" w:hAnsi="Arial"/>
-          <w:sz w:val="24"/>
-          <w:szCs w:val="24"/>
-          <w:lang w:val="id-ID"/>
-        </w:rPr>
-        <w:t xml:space="preserve">Keberlanjutan SIGAP-SJUT ditopang oleh enam pilar:</w:t>
+        <w:t xml:space="preserve">Kelembagaan</w:t>
+      </w:r>
+      <w:r>
+        <w:rPr>
+          <w:rFonts w:ascii="Arial" w:cs="Arial" w:eastAsia="Arial" w:hAnsi="Arial"/>
+          <w:sz w:val="24"/>
+          <w:szCs w:val="24"/>
+          <w:lang w:val="id-ID"/>
+        </w:rPr>
+        <w:t xml:space="preserve">: pemilik proses, SOP, dan standar layanan jelas; indikatornya masuk ke dalam indikator kinerja perangkat daerah dan KPI direksi BUMD.</w:t>
       </w:r>
     </w:p>
     <w:p>
@@ -8413,7 +9607,7 @@
         <w:pStyle w:val="ListParagraph"/>
         <w:numPr>
           <w:ilvl w:val="0"/>
-          <w:numId w:val="4"/>
+          <w:numId w:val="5"/>
         </w:numPr>
         <w:spacing w:after="60" w:before="0" w:line="360"/>
         <w:jc w:val="both"/>
@@ -8427,16 +9621,16 @@
           <w:szCs w:val="24"/>
           <w:lang w:val="id-ID"/>
         </w:rPr>
-        <w:t xml:space="preserve">Regulasi</w:t>
-      </w:r>
-      <w:r>
-        <w:rPr>
-          <w:rFonts w:ascii="Arial" w:cs="Arial" w:eastAsia="Arial" w:hAnsi="Arial"/>
-          <w:sz w:val="24"/>
-          <w:szCs w:val="24"/>
-          <w:lang w:val="id-ID"/>
-        </w:rPr>
-        <w:t xml:space="preserve">: penggunaan SIGAP-SJUT diwajibkan dalam Pergub SJUT dan rencana induk yang terintegrasi dengan RPJMD dan RTRW, sehingga tidak bergantung pada pejabat tertentu.</w:t>
+        <w:t xml:space="preserve">Data</w:t>
+      </w:r>
+      <w:r>
+        <w:rPr>
+          <w:rFonts w:ascii="Arial" w:cs="Arial" w:eastAsia="Arial" w:hAnsi="Arial"/>
+          <w:sz w:val="24"/>
+          <w:szCs w:val="24"/>
+          <w:lang w:val="id-ID"/>
+        </w:rPr>
+        <w:t xml:space="preserve">: pemutakhiran data melekat pada perizinan sehingga data selalu terbarui tanpa proyek pendataan ulang.</w:t>
       </w:r>
     </w:p>
     <w:p>
@@ -8444,7 +9638,7 @@
         <w:pStyle w:val="ListParagraph"/>
         <w:numPr>
           <w:ilvl w:val="0"/>
-          <w:numId w:val="4"/>
+          <w:numId w:val="5"/>
         </w:numPr>
         <w:spacing w:after="60" w:before="0" w:line="360"/>
         <w:jc w:val="both"/>
@@ -8458,16 +9652,16 @@
           <w:szCs w:val="24"/>
           <w:lang w:val="id-ID"/>
         </w:rPr>
-        <w:t xml:space="preserve">Kelembagaan</w:t>
-      </w:r>
-      <w:r>
-        <w:rPr>
-          <w:rFonts w:ascii="Arial" w:cs="Arial" w:eastAsia="Arial" w:hAnsi="Arial"/>
-          <w:sz w:val="24"/>
-          <w:szCs w:val="24"/>
-          <w:lang w:val="id-ID"/>
-        </w:rPr>
-        <w:t xml:space="preserve">: pemilik proses, SOP, dan standar layanan jelas; indikatornya masuk ke dalam indikator kinerja perangkat daerah dan KPI direksi BUMD.</w:t>
+        <w:t xml:space="preserve">Pembiayaan</w:t>
+      </w:r>
+      <w:r>
+        <w:rPr>
+          <w:rFonts w:ascii="Arial" w:cs="Arial" w:eastAsia="Arial" w:hAnsi="Arial"/>
+          <w:sz w:val="24"/>
+          <w:szCs w:val="24"/>
+          <w:lang w:val="id-ID"/>
+        </w:rPr>
+        <w:t xml:space="preserve">: biaya operasional dianggarkan dalam APBD perangkat daerah terkait dan dapat didukung oleh komponen biaya pengelolaan dalam tarif sewa SJUT.</w:t>
       </w:r>
     </w:p>
     <w:p>
@@ -8475,7 +9669,7 @@
         <w:pStyle w:val="ListParagraph"/>
         <w:numPr>
           <w:ilvl w:val="0"/>
-          <w:numId w:val="4"/>
+          <w:numId w:val="5"/>
         </w:numPr>
         <w:spacing w:after="60" w:before="0" w:line="360"/>
         <w:jc w:val="both"/>
@@ -8489,16 +9683,16 @@
           <w:szCs w:val="24"/>
           <w:lang w:val="id-ID"/>
         </w:rPr>
-        <w:t xml:space="preserve">Data</w:t>
-      </w:r>
-      <w:r>
-        <w:rPr>
-          <w:rFonts w:ascii="Arial" w:cs="Arial" w:eastAsia="Arial" w:hAnsi="Arial"/>
-          <w:sz w:val="24"/>
-          <w:szCs w:val="24"/>
-          <w:lang w:val="id-ID"/>
-        </w:rPr>
-        <w:t xml:space="preserve">: pemutakhiran data melekat pada perizinan sehingga data selalu terbarui tanpa proyek pendataan ulang.</w:t>
+        <w:t xml:space="preserve">SDM</w:t>
+      </w:r>
+      <w:r>
+        <w:rPr>
+          <w:rFonts w:ascii="Arial" w:cs="Arial" w:eastAsia="Arial" w:hAnsi="Arial"/>
+          <w:sz w:val="24"/>
+          <w:szCs w:val="24"/>
+          <w:lang w:val="id-ID"/>
+        </w:rPr>
+        <w:t xml:space="preserve">: pelatihan berkala (SIG, manajemen proyek, analitik data) dan manajemen pengetahuan agar sistem tidak bergantung pada individu.</w:t>
       </w:r>
     </w:p>
     <w:p>
@@ -8506,7 +9700,7 @@
         <w:pStyle w:val="ListParagraph"/>
         <w:numPr>
           <w:ilvl w:val="0"/>
-          <w:numId w:val="4"/>
+          <w:numId w:val="5"/>
         </w:numPr>
         <w:spacing w:after="60" w:before="0" w:line="360"/>
         <w:jc w:val="both"/>
@@ -8520,116 +9714,54 @@
           <w:szCs w:val="24"/>
           <w:lang w:val="id-ID"/>
         </w:rPr>
-        <w:t xml:space="preserve">Pembiayaan</w:t>
-      </w:r>
-      <w:r>
-        <w:rPr>
-          <w:rFonts w:ascii="Arial" w:cs="Arial" w:eastAsia="Arial" w:hAnsi="Arial"/>
-          <w:sz w:val="24"/>
-          <w:szCs w:val="24"/>
-          <w:lang w:val="id-ID"/>
-        </w:rPr>
-        <w:t xml:space="preserve">: biaya operasional dianggarkan dalam APBD perangkat daerah terkait dan dapat didukung oleh komponen biaya pengelolaan dalam tarif sewa SJUT.</w:t>
+        <w:t xml:space="preserve">Lingkungan</w:t>
+      </w:r>
+      <w:r>
+        <w:rPr>
+          <w:rFonts w:ascii="Arial" w:cs="Arial" w:eastAsia="Arial" w:hAnsi="Arial"/>
+          <w:sz w:val="24"/>
+          <w:szCs w:val="24"/>
+          <w:lang w:val="id-ID"/>
+        </w:rPr>
+        <w:t xml:space="preserve">: kabel bekas dikelola secara sirkular, mendukung SDGs 9 (infrastruktur tangguh) dan 11 (kota berkelanjutan).</w:t>
       </w:r>
     </w:p>
     <w:p>
       <w:pPr>
-        <w:pStyle w:val="ListParagraph"/>
-        <w:numPr>
-          <w:ilvl w:val="0"/>
-          <w:numId w:val="4"/>
-        </w:numPr>
-        <w:spacing w:after="60" w:before="0" w:line="360"/>
-        <w:jc w:val="both"/>
-      </w:pPr>
-      <w:r>
-        <w:rPr>
-          <w:rFonts w:ascii="Arial" w:cs="Arial" w:eastAsia="Arial" w:hAnsi="Arial"/>
-          <w:b/>
-          <w:bCs/>
-          <w:sz w:val="24"/>
-          <w:szCs w:val="24"/>
-          <w:lang w:val="id-ID"/>
-        </w:rPr>
-        <w:t xml:space="preserve">SDM</w:t>
-      </w:r>
-      <w:r>
-        <w:rPr>
-          <w:rFonts w:ascii="Arial" w:cs="Arial" w:eastAsia="Arial" w:hAnsi="Arial"/>
-          <w:sz w:val="24"/>
-          <w:szCs w:val="24"/>
-          <w:lang w:val="id-ID"/>
-        </w:rPr>
-        <w:t xml:space="preserve">: pelatihan berkala (SIG, manajemen proyek, analitik data) dan manajemen pengetahuan agar sistem tidak bergantung pada individu.</w:t>
+        <w:pStyle w:val="Heading3"/>
+      </w:pPr>
+      <w:r>
+        <w:rPr>
+          <w:rFonts w:ascii="Arial" w:cs="Arial" w:eastAsia="Arial" w:hAnsi="Arial"/>
+          <w:sz w:val="24"/>
+          <w:szCs w:val="24"/>
+          <w:lang w:val="id-ID"/>
+        </w:rPr>
+        <w:t xml:space="preserve">5) </w:t>
+      </w:r>
+      <w:r>
+        <w:rPr>
+          <w:rFonts w:ascii="Arial" w:cs="Arial" w:eastAsia="Arial" w:hAnsi="Arial"/>
+          <w:i/>
+          <w:iCs/>
+          <w:sz w:val="24"/>
+          <w:szCs w:val="24"/>
+          <w:lang w:val="id-ID"/>
+        </w:rPr>
+        <w:t xml:space="preserve">Organization Value</w:t>
+      </w:r>
+      <w:r>
+        <w:rPr>
+          <w:rFonts w:ascii="Arial" w:cs="Arial" w:eastAsia="Arial" w:hAnsi="Arial"/>
+          <w:sz w:val="24"/>
+          <w:szCs w:val="24"/>
+          <w:lang w:val="id-ID"/>
+        </w:rPr>
+        <w:t xml:space="preserve"> (Selaras dengan Nilai BerAKHLAK)</w:t>
       </w:r>
     </w:p>
     <w:p>
       <w:pPr>
-        <w:pStyle w:val="ListParagraph"/>
-        <w:numPr>
-          <w:ilvl w:val="0"/>
-          <w:numId w:val="4"/>
-        </w:numPr>
-        <w:spacing w:after="60" w:before="0" w:line="360"/>
-        <w:jc w:val="both"/>
-      </w:pPr>
-      <w:r>
-        <w:rPr>
-          <w:rFonts w:ascii="Arial" w:cs="Arial" w:eastAsia="Arial" w:hAnsi="Arial"/>
-          <w:b/>
-          <w:bCs/>
-          <w:sz w:val="24"/>
-          <w:szCs w:val="24"/>
-          <w:lang w:val="id-ID"/>
-        </w:rPr>
-        <w:t xml:space="preserve">Lingkungan</w:t>
-      </w:r>
-      <w:r>
-        <w:rPr>
-          <w:rFonts w:ascii="Arial" w:cs="Arial" w:eastAsia="Arial" w:hAnsi="Arial"/>
-          <w:sz w:val="24"/>
-          <w:szCs w:val="24"/>
-          <w:lang w:val="id-ID"/>
-        </w:rPr>
-        <w:t xml:space="preserve">: kabel bekas dikelola secara sirkular, mendukung SDGs 9 (infrastruktur tangguh) dan 11 (kota berkelanjutan).</w:t>
-      </w:r>
-    </w:p>
-    <w:p>
-      <w:pPr>
-        <w:pStyle w:val="Heading3"/>
-      </w:pPr>
-      <w:r>
-        <w:rPr>
-          <w:rFonts w:ascii="Arial" w:cs="Arial" w:eastAsia="Arial" w:hAnsi="Arial"/>
-          <w:sz w:val="24"/>
-          <w:szCs w:val="24"/>
-          <w:lang w:val="id-ID"/>
-        </w:rPr>
-        <w:t xml:space="preserve">5) </w:t>
-      </w:r>
-      <w:r>
-        <w:rPr>
-          <w:rFonts w:ascii="Arial" w:cs="Arial" w:eastAsia="Arial" w:hAnsi="Arial"/>
-          <w:i/>
-          <w:iCs/>
-          <w:sz w:val="24"/>
-          <w:szCs w:val="24"/>
-          <w:lang w:val="id-ID"/>
-        </w:rPr>
-        <w:t xml:space="preserve">Organization Value</w:t>
-      </w:r>
-      <w:r>
-        <w:rPr>
-          <w:rFonts w:ascii="Arial" w:cs="Arial" w:eastAsia="Arial" w:hAnsi="Arial"/>
-          <w:sz w:val="24"/>
-          <w:szCs w:val="24"/>
-          <w:lang w:val="id-ID"/>
-        </w:rPr>
-        <w:t xml:space="preserve"> (Selaras dengan Nilai BerAKHLAK)</w:t>
-      </w:r>
-    </w:p>
-    <w:p>
-      <w:pPr>
         <w:spacing w:after="120" w:before="0" w:line="360"/>
         <w:jc w:val="both"/>
       </w:pPr>
@@ -8640,7 +9772,7 @@
           <w:szCs w:val="24"/>
           <w:lang w:val="id-ID"/>
         </w:rPr>
-        <w:t xml:space="preserve">SIGAP-SJUT selaras dengan nilai dasar ASN BerAKHLAK sebagaimana diatur dalam UU Nomor 20 Tahun 2023 tentang ASN (Tabel 7).</w:t>
+        <w:t xml:space="preserve">SIGAP-SJUT selaras dengan nilai dasar ASN BerAKHLAK sebagaimana diatur dalam UU Nomor 20 Tahun 2023 tentang ASN (Tabel 8).</w:t>
       </w:r>
     </w:p>
     <w:p>
@@ -8658,7 +9790,7 @@
           <w:szCs w:val="22"/>
           <w:lang w:val="id-ID"/>
         </w:rPr>
-        <w:t xml:space="preserve">Tabel 7. Keselarasan SIGAP-SJUT dengan Nilai BerAKHLAK</w:t>
+        <w:t xml:space="preserve">Tabel 8. Keselarasan SIGAP-SJUT dengan Nilai BerAKHLAK</w:t>
       </w:r>
     </w:p>
     <w:tbl>
@@ -9198,7 +10330,7 @@
           <w:szCs w:val="24"/>
           <w:lang w:val="id-ID"/>
         </w:rPr>
-        <w:t xml:space="preserve">Agar tidak berhenti sebagai gagasan, SIGAP-SJUT dilaksanakan secara bertahap (Tabel 8).</w:t>
+        <w:t xml:space="preserve">Agar tidak berhenti sebagai gagasan, SIGAP-SJUT dilaksanakan secara bertahap (Tabel 9).</w:t>
       </w:r>
     </w:p>
     <w:p>
@@ -9216,7 +10348,7 @@
           <w:szCs w:val="22"/>
           <w:lang w:val="id-ID"/>
         </w:rPr>
-        <w:t xml:space="preserve">Tabel 8. Tahapan Implementasi dan Indikator Keberhasilan</w:t>
+        <w:t xml:space="preserve">Tabel 9. Tahapan Implementasi dan Indikator Keberhasilan</w:t>
       </w:r>
     </w:p>
     <w:tbl>
@@ -10042,7 +11174,7 @@
         <w:pStyle w:val="ListParagraph"/>
         <w:numPr>
           <w:ilvl w:val="0"/>
-          <w:numId w:val="6"/>
+          <w:numId w:val="7"/>
         </w:numPr>
         <w:spacing w:after="60" w:before="0" w:line="360"/>
         <w:jc w:val="both"/>
@@ -10082,7 +11214,7 @@
         <w:pStyle w:val="ListParagraph"/>
         <w:numPr>
           <w:ilvl w:val="0"/>
-          <w:numId w:val="6"/>
+          <w:numId w:val="7"/>
         </w:numPr>
         <w:spacing w:after="60" w:before="0" w:line="360"/>
         <w:jc w:val="both"/>
@@ -10102,7 +11234,7 @@
         <w:pStyle w:val="ListParagraph"/>
         <w:numPr>
           <w:ilvl w:val="0"/>
-          <w:numId w:val="6"/>
+          <w:numId w:val="7"/>
         </w:numPr>
         <w:spacing w:after="60" w:before="0" w:line="360"/>
         <w:jc w:val="both"/>
@@ -10122,7 +11254,7 @@
         <w:pStyle w:val="ListParagraph"/>
         <w:numPr>
           <w:ilvl w:val="0"/>
-          <w:numId w:val="6"/>
+          <w:numId w:val="7"/>
         </w:numPr>
         <w:spacing w:after="60" w:before="0" w:line="360"/>
         <w:jc w:val="both"/>
@@ -10528,18 +11660,24 @@
     </w:lvlOverride>
   </w:num>
   <w:num w:numId="4">
+    <w:abstractNumId w:val="2"/>
+    <w:lvlOverride w:ilvl="0">
+      <w:startOverride w:val="1"/>
+    </w:lvlOverride>
+  </w:num>
+  <w:num w:numId="5">
     <w:abstractNumId w:val="4"/>
     <w:lvlOverride w:ilvl="0">
       <w:startOverride w:val="1"/>
     </w:lvlOverride>
   </w:num>
-  <w:num w:numId="5">
+  <w:num w:numId="6">
     <w:abstractNumId w:val="3"/>
     <w:lvlOverride w:ilvl="0">
       <w:startOverride w:val="1"/>
     </w:lvlOverride>
   </w:num>
-  <w:num w:numId="6">
+  <w:num w:numId="7">
     <w:abstractNumId w:val="2"/>
     <w:lvlOverride w:ilvl="0">
       <w:startOverride w:val="1"/>

</xml_diff>